<commit_message>
chore: upload complete project workspace
</commit_message>
<xml_diff>
--- a/report/generated/Bao_cao_Topic_1_Doan_Sinh_Duc.docx
+++ b/report/generated/Bao_cao_Topic_1_Doan_Sinh_Duc.docx
@@ -206,9 +206,26 @@
         <w:ind w:left="90" w:right="69"/>
         <w:jc w:val="center"/>
         <w:rPr>
+          <w:color w:val="FF0000"/>
           <w:szCs w:val="28"/>
-        </w:rPr>
-      </w:pPr>
+          <w:lang w:val="vi-VN"/>
+        </w:rPr>
+      </w:pPr>
+      <w:r>
+        <w:rPr>
+          <w:color w:val="FF0000"/>
+          <w:szCs w:val="28"/>
+        </w:rPr>
+        <w:t>Đề</w:t>
+      </w:r>
+      <w:r>
+        <w:rPr>
+          <w:color w:val="FF0000"/>
+          <w:szCs w:val="28"/>
+          <w:lang w:val="vi-VN"/>
+        </w:rPr>
+        <w:t xml:space="preserve"> tài 1: ...</w:t>
+      </w:r>
     </w:p>
     <w:p>
       <w:pPr>
@@ -289,19 +306,138 @@
               <w:ind w:right="69"/>
               <w:jc w:val="left"/>
               <w:rPr>
-                <w:b/>
-                <w:sz w:val="26"/>
-                <w:szCs w:val="26"/>
-              </w:rPr>
-            </w:pPr>
-            <w:r>
-              <w:rPr>
                 <w:rFonts w:eastAsia="Times New Roman"/>
                 <w:b/>
                 <w:sz w:val="26"/>
                 <w:szCs w:val="26"/>
-              </w:rPr>
-              <w:t>Đoàn Sinh Đức</w:t>
+                <w:lang w:val="vi-VN"/>
+              </w:rPr>
+            </w:pPr>
+            <w:r>
+              <w:rPr>
+                <w:rFonts w:eastAsia="Times New Roman"/>
+                <w:b/>
+                <w:sz w:val="26"/>
+                <w:szCs w:val="26"/>
+              </w:rPr>
+              <w:t xml:space="preserve">Đoàn Sinh </w:t>
+            </w:r>
+            <w:r>
+              <w:rPr>
+                <w:rFonts w:eastAsia="Times New Roman"/>
+                <w:b/>
+                <w:sz w:val="26"/>
+                <w:szCs w:val="26"/>
+              </w:rPr>
+              <w:t>Đức</w:t>
+            </w:r>
+            <w:r>
+              <w:rPr>
+                <w:rFonts w:eastAsia="Times New Roman"/>
+                <w:b/>
+                <w:sz w:val="26"/>
+                <w:szCs w:val="26"/>
+                <w:lang w:val="vi-VN"/>
+              </w:rPr>
+              <w:t xml:space="preserve"> 20234000</w:t>
+            </w:r>
+          </w:p>
+          <w:p>
+            <w:pPr>
+              <w:ind w:right="69"/>
+              <w:jc w:val="left"/>
+              <w:rPr>
+                <w:rFonts w:eastAsia="Times New Roman"/>
+                <w:b/>
+                <w:sz w:val="26"/>
+                <w:szCs w:val="26"/>
+                <w:lang w:val="vi-VN"/>
+              </w:rPr>
+            </w:pPr>
+            <w:r>
+              <w:rPr>
+                <w:rFonts w:eastAsia="Times New Roman"/>
+                <w:b/>
+                <w:sz w:val="26"/>
+                <w:szCs w:val="26"/>
+                <w:lang w:val="vi-VN"/>
+              </w:rPr>
+              <w:t xml:space="preserve">Phạm Đăng </w:t>
+            </w:r>
+            <w:r>
+              <w:rPr>
+                <w:rFonts w:eastAsia="Times New Roman"/>
+                <w:b/>
+                <w:sz w:val="26"/>
+                <w:szCs w:val="26"/>
+                <w:lang w:val="vi-VN"/>
+              </w:rPr>
+              <w:t>Vinh: 20233719</w:t>
+            </w:r>
+          </w:p>
+          <w:p>
+            <w:pPr>
+              <w:ind w:right="69"/>
+              <w:jc w:val="left"/>
+              <w:rPr>
+                <w:rFonts w:eastAsia="Times New Roman"/>
+                <w:b/>
+                <w:sz w:val="26"/>
+                <w:szCs w:val="26"/>
+                <w:lang w:val="vi-VN"/>
+              </w:rPr>
+            </w:pPr>
+            <w:r>
+              <w:rPr>
+                <w:rFonts w:eastAsia="Times New Roman"/>
+                <w:b/>
+                <w:sz w:val="26"/>
+                <w:szCs w:val="26"/>
+                <w:lang w:val="vi-VN"/>
+              </w:rPr>
+              <w:t xml:space="preserve">Vũ Mạnh </w:t>
+            </w:r>
+            <w:r>
+              <w:rPr>
+                <w:rFonts w:eastAsia="Times New Roman"/>
+                <w:b/>
+                <w:sz w:val="26"/>
+                <w:szCs w:val="26"/>
+                <w:lang w:val="vi-VN"/>
+              </w:rPr>
+              <w:t>Quân: 20234033</w:t>
+            </w:r>
+          </w:p>
+          <w:p>
+            <w:pPr>
+              <w:ind w:right="69"/>
+              <w:jc w:val="left"/>
+              <w:rPr>
+                <w:b/>
+                <w:sz w:val="26"/>
+                <w:szCs w:val="26"/>
+                <w:lang w:val="vi-VN"/>
+              </w:rPr>
+            </w:pPr>
+            <w:r>
+              <w:rPr>
+                <w:rFonts w:eastAsia="Times New Roman"/>
+                <w:b/>
+                <w:sz w:val="26"/>
+                <w:szCs w:val="26"/>
+                <w:lang w:val="vi-VN"/>
+              </w:rPr>
+              <w:t xml:space="preserve">Vũ Nam </w:t>
+            </w:r>
+            <w:r>
+              <w:rPr>
+                <w:rFonts w:eastAsia="Times New Roman"/>
+                <w:b/>
+                <w:sz w:val="26"/>
+                <w:szCs w:val="26"/>
+                <w:lang w:val="vi-VN"/>
+              </w:rPr>
+              <w:t>Khánh: 20234015</w:t>
             </w:r>
           </w:p>
           <w:p>
@@ -2916,16 +3052,37 @@
     <w:p>
       <w:pPr>
         <w:pStyle w:val="Compact"/>
-      </w:pPr>
-      <w:r>
         <w:rPr>
           <w:rFonts w:ascii="Times New Roman" w:eastAsia="Times New Roman" w:hAnsi="Times New Roman"/>
+          <w:lang w:val="vi-VN"/>
+        </w:rPr>
+      </w:pPr>
+      <w:r>
+        <w:rPr>
+          <w:rFonts w:ascii="Times New Roman" w:eastAsia="Times New Roman" w:hAnsi="Times New Roman"/>
         </w:rPr>
         <w:t>Hỗ trợ khung giải mã UART và I2C, đồng thời để mở khả năng bổ sung các decoder khác như SPI.</w:t>
       </w:r>
     </w:p>
     <w:p>
       <w:pPr>
+        <w:pStyle w:val="Compact"/>
+        <w:rPr>
+          <w:color w:val="FF0000"/>
+          <w:lang w:val="vi-VN"/>
+        </w:rPr>
+      </w:pPr>
+      <w:r>
+        <w:rPr>
+          <w:rFonts w:ascii="Times New Roman" w:eastAsia="Times New Roman" w:hAnsi="Times New Roman"/>
+          <w:color w:val="FF0000"/>
+          <w:lang w:val="vi-VN"/>
+        </w:rPr>
+        <w:t>Phần trăm sử dụng AI</w:t>
+      </w:r>
+    </w:p>
+    <w:p>
+      <w:pPr>
         <w:pStyle w:val="Heading2"/>
       </w:pPr>
       <w:bookmarkStart w:id="6" w:name="_Toc234276598"/>
@@ -2933,6 +3090,19 @@
         <w:t>Yêu cầu của Topic 1</w:t>
       </w:r>
       <w:bookmarkEnd w:id="6"/>
+      <w:r>
+        <w:rPr>
+          <w:lang w:val="vi-VN"/>
+        </w:rPr>
+        <w:t xml:space="preserve">   </w:t>
+      </w:r>
+      <w:r>
+        <w:rPr>
+          <w:color w:val="FF0000"/>
+          <w:lang w:val="vi-VN"/>
+        </w:rPr>
+        <w:t>Chỉ tiêu chức năng/ Chỉ tiêu phi chức năng</w:t>
+      </w:r>
     </w:p>
     <w:p>
       <w:pPr>
@@ -3196,7 +3366,15 @@
                 <w:rFonts w:ascii="Times New Roman" w:eastAsia="Times New Roman" w:hAnsi="Times New Roman"/>
                 <w:sz w:val="26"/>
               </w:rPr>
-              <w:t>Firmware/UI có cấu hình từ 1 kHz; cần đo thực tế trên board.</w:t>
+              <w:t xml:space="preserve">Firmware/UI có cấu hình từ 1 kHz; cần đo thực tế </w:t>
+            </w:r>
+            <w:r>
+              <w:rPr>
+                <w:rFonts w:ascii="Times New Roman" w:eastAsia="Times New Roman" w:hAnsi="Times New Roman"/>
+                <w:sz w:val="26"/>
+              </w:rPr>
+              <w:lastRenderedPageBreak/>
+              <w:t>trên board.</w:t>
             </w:r>
           </w:p>
         </w:tc>
@@ -3511,6 +3689,9 @@
     <w:p>
       <w:pPr>
         <w:pStyle w:val="Heading1"/>
+        <w:rPr>
+          <w:lang w:val="vi-VN"/>
+        </w:rPr>
       </w:pPr>
       <w:bookmarkStart w:id="8" w:name="_Toc234276600"/>
       <w:r>
@@ -3520,6 +3701,76 @@
     </w:p>
     <w:p>
       <w:pPr>
+        <w:rPr>
+          <w:lang w:val="vi-VN"/>
+        </w:rPr>
+      </w:pPr>
+    </w:p>
+    <w:p>
+      <w:pPr>
+        <w:jc w:val="left"/>
+        <w:rPr>
+          <w:color w:val="FF0000"/>
+          <w:lang w:val="vi-VN"/>
+        </w:rPr>
+      </w:pPr>
+      <w:r>
+        <w:rPr>
+          <w:color w:val="FF0000"/>
+          <w:lang w:val="vi-VN"/>
+        </w:rPr>
+        <w:t xml:space="preserve">Cơ sở lý thuyết STM32, </w:t>
+      </w:r>
+      <w:r>
+        <w:rPr>
+          <w:color w:val="FF0000"/>
+          <w:lang w:val="vi-VN"/>
+        </w:rPr>
+        <w:br/>
+        <w:t xml:space="preserve">Xung thạch anh tới tốc độ xử lý của STM32 </w:t>
+      </w:r>
+    </w:p>
+    <w:p>
+      <w:pPr>
+        <w:jc w:val="left"/>
+        <w:rPr>
+          <w:color w:val="FF0000"/>
+          <w:lang w:val="vi-VN"/>
+        </w:rPr>
+      </w:pPr>
+      <w:r>
+        <w:rPr>
+          <w:color w:val="FF0000"/>
+          <w:lang w:val="vi-VN"/>
+        </w:rPr>
+        <w:t>Thêm ảnh mô tả Lý thuyết,</w:t>
+      </w:r>
+      <w:r>
+        <w:rPr>
+          <w:color w:val="FF0000"/>
+          <w:lang w:val="vi-VN"/>
+        </w:rPr>
+        <w:br/>
+        <w:t>VD ảnh giao thức, stm32, LA</w:t>
+      </w:r>
+      <w:r>
+        <w:rPr>
+          <w:color w:val="FF0000"/>
+          <w:lang w:val="vi-VN"/>
+        </w:rPr>
+        <w:br/>
+      </w:r>
+      <w:r>
+        <w:rPr>
+          <w:color w:val="FF0000"/>
+          <w:lang w:val="vi-VN"/>
+        </w:rPr>
+        <w:br/>
+        <w:t>Xem thuật toán khử nhiễu, aligsing</w:t>
+      </w:r>
+    </w:p>
+    <w:p>
+      <w:pPr>
         <w:pStyle w:val="Heading2"/>
       </w:pPr>
       <w:bookmarkStart w:id="9" w:name="_Toc234276601"/>
@@ -3547,6 +3798,7 @@
         <w:rPr>
           <w:rFonts w:ascii="Times New Roman" w:eastAsia="Times New Roman" w:hAnsi="Times New Roman"/>
         </w:rPr>
+        <w:lastRenderedPageBreak/>
         <w:t>Trong cấu hình đơn giản, mỗi chu kỳ lấy mẫu tạo ra một snapshot gồm trạng thái của toàn bộ kênh đầu vào. Khi biết chu kỳ lấy mẫu, phần mềm có thể gán mốc thời gian cho từng mẫu và dựng lại waveform dạng bậc thang. Đây là hướng phù hợp với Topic 1 vì không yêu cầu truyền dữ liệu thời gian thực liên tục.</w:t>
       </w:r>
     </w:p>
@@ -3559,6 +3811,26 @@
         <w:t>Tốc độ lấy mẫu và aliasing</w:t>
       </w:r>
       <w:bookmarkEnd w:id="10"/>
+      <w:r>
+        <w:rPr>
+          <w:lang w:val="vi-VN"/>
+        </w:rPr>
+        <w:t xml:space="preserve">  </w:t>
+      </w:r>
+      <w:r>
+        <w:rPr>
+          <w:color w:val="FF0000"/>
+          <w:lang w:val="vi-VN"/>
+        </w:rPr>
+        <w:t xml:space="preserve">Có công thức, định lý </w:t>
+      </w:r>
+      <w:r>
+        <w:rPr>
+          <w:color w:val="FF0000"/>
+          <w:lang w:val="vi-VN"/>
+        </w:rPr>
+        <w:t>Nyquist, rõ thêm về aliasing</w:t>
+      </w:r>
     </w:p>
     <w:p>
       <w:pPr>
@@ -3579,86 +3851,118 @@
         <w:rPr>
           <w:rFonts w:ascii="Times New Roman" w:eastAsia="Times New Roman" w:hAnsi="Times New Roman"/>
         </w:rPr>
+        <w:t>Trong phiên bản hiện tại, firmware trả về tốc độ lấy mẫu thực tế sau khi tính toán prescaler và autoreload của TIM2. Tuy nhiên, sai số timing cuối cùng còn phụ thuộc jitter ngắt, thời gian thực thi ISR và đặc tính board thực tế, nên các đại lượng này cần được đo bằng thực nghiệm.</w:t>
+      </w:r>
+    </w:p>
+    <w:p>
+      <w:pPr>
+        <w:pStyle w:val="Heading2"/>
+      </w:pPr>
+      <w:bookmarkStart w:id="11" w:name="_Toc234276603"/>
+      <w:r>
+        <w:t>Quan hệ timing giữa các kênh</w:t>
+      </w:r>
+      <w:bookmarkEnd w:id="11"/>
+    </w:p>
+    <w:p>
+      <w:pPr>
+        <w:pStyle w:val="FirstParagraph"/>
+      </w:pPr>
+      <w:r>
+        <w:rPr>
+          <w:rFonts w:ascii="Times New Roman" w:eastAsia="Times New Roman" w:hAnsi="Times New Roman"/>
+        </w:rPr>
+        <w:t>Để giảm lệch thời điểm giữa các kênh, firmware đọc một lần thanh ghi IDR của GPIOA rồi tách bit cho CH0..CH7. Cách làm này hợp lý hơn việc đọc tuần tự từng chân bằng hàm mức cao, vì toàn bộ trạng thái của 8 kênh được lấy từ cùng một snapshot phần cứng.</w:t>
+      </w:r>
+    </w:p>
+    <w:p>
+      <w:pPr>
+        <w:pStyle w:val="BodyText"/>
+      </w:pPr>
+      <w:r>
+        <w:rPr>
+          <w:rFonts w:ascii="Times New Roman" w:eastAsia="Times New Roman" w:hAnsi="Times New Roman"/>
+        </w:rPr>
+        <w:t>Giới hạn của cách phân tích hiện tại là chưa có số đo thực nghiệm về skew hoặc jitter. Do đó, báo cáo chỉ khẳng định nguyên lý thiết kế và cấu trúc mã nguồn; phần đánh giá định lượng được giữ trong khung kết quả cần bổ sung.</w:t>
+      </w:r>
+    </w:p>
+    <w:p>
+      <w:pPr>
+        <w:pStyle w:val="Heading2"/>
+      </w:pPr>
+      <w:bookmarkStart w:id="12" w:name="_Toc234276604"/>
+      <w:r>
+        <w:t>Giao thức truyền dữ liệu sau capture</w:t>
+      </w:r>
+      <w:bookmarkEnd w:id="12"/>
+    </w:p>
+    <w:p>
+      <w:pPr>
+        <w:pStyle w:val="FirstParagraph"/>
+        <w:rPr>
+          <w:rFonts w:ascii="Times New Roman" w:eastAsia="Times New Roman" w:hAnsi="Times New Roman"/>
+          <w:lang w:val="vi-VN"/>
+        </w:rPr>
+      </w:pPr>
+      <w:r>
+        <w:rPr>
+          <w:rFonts w:ascii="Times New Roman" w:eastAsia="Times New Roman" w:hAnsi="Times New Roman"/>
+        </w:rPr>
+        <w:t>Sau khi capture hoàn tất, firmware gửi dữ liệu cho PC theo frame SLA8. Mỗi mẫu được lưu bằng một byte, trong đó bit 0 đến bit 7 tương ứng CH0 đến CH7. Header của frame chứa magic, version, số kênh, sample rate, số mẫu, vị trí trigger, flags và checksum để phần mềm PC kiểm tra trước khi hiển thị.</w:t>
+      </w:r>
+    </w:p>
+    <w:p>
+      <w:pPr>
+        <w:pStyle w:val="BodyText"/>
+        <w:rPr>
+          <w:lang w:val="vi-VN"/>
+        </w:rPr>
+      </w:pPr>
+    </w:p>
+    <w:p>
+      <w:pPr>
+        <w:pStyle w:val="BodyText"/>
+        <w:rPr>
+          <w:color w:val="FF0000"/>
+          <w:lang w:val="vi-VN"/>
+        </w:rPr>
+      </w:pPr>
+      <w:r>
+        <w:rPr>
+          <w:color w:val="FF0000"/>
+          <w:lang w:val="vi-VN"/>
+        </w:rPr>
+        <w:t>Lý thuyết về mạch bảo vệ</w:t>
+      </w:r>
+    </w:p>
+    <w:p>
+      <w:pPr>
+        <w:pStyle w:val="Heading1"/>
+      </w:pPr>
+      <w:bookmarkStart w:id="13" w:name="_Toc234276605"/>
+      <w:r>
         <w:lastRenderedPageBreak/>
-        <w:t>Trong phiên bản hiện tại, firmware trả về tốc độ lấy mẫu thực tế sau khi tính toán prescaler và autoreload của TIM2. Tuy nhiên, sai số timing cuối cùng còn phụ thuộc jitter ngắt, thời gian thực thi ISR và đặc tính board thực tế, nên các đại lượng này cần được đo bằng thực nghiệm.</w:t>
-      </w:r>
+        <w:t>THIẾT KẾ HỆ THỐNG</w:t>
+      </w:r>
+      <w:bookmarkEnd w:id="13"/>
     </w:p>
     <w:p>
       <w:pPr>
         <w:pStyle w:val="Heading2"/>
       </w:pPr>
-      <w:bookmarkStart w:id="11" w:name="_Toc234276603"/>
-      <w:r>
-        <w:t>Quan hệ timing giữa các kênh</w:t>
-      </w:r>
-      <w:bookmarkEnd w:id="11"/>
+      <w:bookmarkStart w:id="14" w:name="_Toc234276606"/>
+      <w:r>
+        <w:t>Kiến trúc tổng thể</w:t>
+      </w:r>
+      <w:bookmarkEnd w:id="14"/>
     </w:p>
     <w:p>
       <w:pPr>
         <w:pStyle w:val="FirstParagraph"/>
-      </w:pPr>
-      <w:r>
-        <w:rPr>
-          <w:rFonts w:ascii="Times New Roman" w:eastAsia="Times New Roman" w:hAnsi="Times New Roman"/>
-        </w:rPr>
-        <w:t>Để giảm lệch thời điểm giữa các kênh, firmware đọc một lần thanh ghi IDR của GPIOA rồi tách bit cho CH0..CH7. Cách làm này hợp lý hơn việc đọc tuần tự từng chân bằng hàm mức cao, vì toàn bộ trạng thái của 8 kênh được lấy từ cùng một snapshot phần cứng.</w:t>
-      </w:r>
-    </w:p>
-    <w:p>
-      <w:pPr>
-        <w:pStyle w:val="BodyText"/>
-      </w:pPr>
-      <w:r>
-        <w:rPr>
-          <w:rFonts w:ascii="Times New Roman" w:eastAsia="Times New Roman" w:hAnsi="Times New Roman"/>
-        </w:rPr>
-        <w:t>Giới hạn của cách phân tích hiện tại là chưa có số đo thực nghiệm về skew hoặc jitter. Do đó, báo cáo chỉ khẳng định nguyên lý thiết kế và cấu trúc mã nguồn; phần đánh giá định lượng được giữ trong khung kết quả cần bổ sung.</w:t>
-      </w:r>
-    </w:p>
-    <w:p>
-      <w:pPr>
-        <w:pStyle w:val="Heading2"/>
-      </w:pPr>
-      <w:bookmarkStart w:id="12" w:name="_Toc234276604"/>
-      <w:r>
-        <w:t>Giao thức truyền dữ liệu sau capture</w:t>
-      </w:r>
-      <w:bookmarkEnd w:id="12"/>
-    </w:p>
-    <w:p>
-      <w:pPr>
-        <w:pStyle w:val="FirstParagraph"/>
-      </w:pPr>
-      <w:r>
-        <w:rPr>
-          <w:rFonts w:ascii="Times New Roman" w:eastAsia="Times New Roman" w:hAnsi="Times New Roman"/>
-        </w:rPr>
-        <w:t>Sau khi capture hoàn tất, firmware gửi dữ liệu cho PC theo frame SLA8. Mỗi mẫu được lưu bằng một byte, trong đó bit 0 đến bit 7 tương ứng CH0 đến CH7. Header của frame chứa magic, version, số kênh, sample rate, số mẫu, vị trí trigger, flags và checksum để phần mềm PC kiểm tra trước khi hiển thị.</w:t>
-      </w:r>
-    </w:p>
-    <w:p>
-      <w:pPr>
-        <w:pStyle w:val="Heading1"/>
-      </w:pPr>
-      <w:bookmarkStart w:id="13" w:name="_Toc234276605"/>
-      <w:r>
-        <w:t>THIẾT KẾ HỆ THỐNG</w:t>
-      </w:r>
-      <w:bookmarkEnd w:id="13"/>
-    </w:p>
-    <w:p>
-      <w:pPr>
-        <w:pStyle w:val="Heading2"/>
-      </w:pPr>
-      <w:bookmarkStart w:id="14" w:name="_Toc234276606"/>
-      <w:r>
-        <w:t>Kiến trúc tổng thể</w:t>
-      </w:r>
-      <w:bookmarkEnd w:id="14"/>
-    </w:p>
-    <w:p>
-      <w:pPr>
-        <w:pStyle w:val="FirstParagraph"/>
+        <w:rPr>
+          <w:color w:val="FF0000"/>
+          <w:lang w:val="vi-VN"/>
+        </w:rPr>
       </w:pPr>
       <w:r>
         <w:rPr>
@@ -3812,7 +4116,6 @@
                 <w:rFonts w:ascii="Times New Roman" w:eastAsia="Times New Roman" w:hAnsi="Times New Roman"/>
                 <w:sz w:val="26"/>
               </w:rPr>
-              <w:lastRenderedPageBreak/>
               <w:t>Thành phần</w:t>
             </w:r>
           </w:p>
@@ -4238,7 +4541,14 @@
         <w:rPr>
           <w:rFonts w:ascii="Times New Roman" w:eastAsia="Times New Roman" w:hAnsi="Times New Roman"/>
         </w:rPr>
-        <w:t>Firmware đảm nhiệm toàn bộ quá trình thu thập dữ liệu: khởi tạo ngoại vi, nhận lệnh điều khiển từ PC, cấu hình timer, quản lý trigger, ghi mẫu vào buffer và truyền frame sau khi capture kết thúc. Các chức năng được tách thành các khối rõ ràng gồm cấu hình phần cứng, lõi capture, đóng gói giao thức, xử lý trigger và đo chu kỳ thực thi khi cần benchmark.</w:t>
+        <w:t xml:space="preserve">Firmware đảm nhiệm toàn bộ quá trình thu thập dữ liệu: khởi tạo ngoại vi, nhận lệnh điều khiển từ PC, cấu hình timer, quản lý trigger, ghi mẫu vào buffer và truyền frame sau khi </w:t>
+      </w:r>
+      <w:r>
+        <w:rPr>
+          <w:rFonts w:ascii="Times New Roman" w:eastAsia="Times New Roman" w:hAnsi="Times New Roman"/>
+        </w:rPr>
+        <w:lastRenderedPageBreak/>
+        <w:t>capture kết thúc. Các chức năng được tách thành các khối rõ ràng gồm cấu hình phần cứng, lõi capture, đóng gói giao thức, xử lý trigger và đo chu kỳ thực thi khi cần benchmark.</w:t>
       </w:r>
     </w:p>
     <w:p>
@@ -4274,6 +4584,495 @@
           <w:rFonts w:eastAsia="Times New Roman"/>
         </w:rPr>
         <w:t xml:space="preserve"> Vai trò các mô-đun firmware</w:t>
+      </w:r>
+    </w:p>
+    <w:tbl>
+      <w:tblPr>
+        <w:tblStyle w:val="TableGrid"/>
+        <w:tblW w:w="0" w:type="auto"/>
+        <w:tblBorders>
+          <w:top w:val="single" w:sz="4" w:space="0" w:color="000000"/>
+          <w:left w:val="single" w:sz="4" w:space="0" w:color="000000"/>
+          <w:bottom w:val="single" w:sz="4" w:space="0" w:color="000000"/>
+          <w:right w:val="single" w:sz="4" w:space="0" w:color="000000"/>
+          <w:insideH w:val="single" w:sz="4" w:space="0" w:color="000000"/>
+          <w:insideV w:val="single" w:sz="4" w:space="0" w:color="000000"/>
+        </w:tblBorders>
+        <w:tblLook w:val="04A0" w:firstRow="1" w:lastRow="0" w:firstColumn="1" w:lastColumn="0" w:noHBand="0" w:noVBand="1"/>
+      </w:tblPr>
+      <w:tblGrid>
+        <w:gridCol w:w="2235"/>
+        <w:gridCol w:w="6833"/>
+      </w:tblGrid>
+      <w:tr>
+        <w:tc>
+          <w:tcPr>
+            <w:tcW w:w="2235" w:type="dxa"/>
+            <w:tcBorders>
+              <w:top w:val="single" w:sz="4" w:space="0" w:color="000000"/>
+              <w:left w:val="single" w:sz="4" w:space="0" w:color="000000"/>
+              <w:bottom w:val="single" w:sz="4" w:space="0" w:color="000000"/>
+              <w:right w:val="single" w:sz="4" w:space="0" w:color="000000"/>
+            </w:tcBorders>
+          </w:tcPr>
+          <w:p>
+            <w:pPr>
+              <w:pStyle w:val="Compact"/>
+            </w:pPr>
+            <w:r>
+              <w:rPr>
+                <w:rFonts w:ascii="Times New Roman" w:eastAsia="Times New Roman" w:hAnsi="Times New Roman"/>
+                <w:sz w:val="26"/>
+              </w:rPr>
+              <w:t>Mô-đun</w:t>
+            </w:r>
+          </w:p>
+        </w:tc>
+        <w:tc>
+          <w:tcPr>
+            <w:tcW w:w="6833" w:type="dxa"/>
+            <w:tcBorders>
+              <w:top w:val="single" w:sz="4" w:space="0" w:color="000000"/>
+              <w:left w:val="single" w:sz="4" w:space="0" w:color="000000"/>
+              <w:bottom w:val="single" w:sz="4" w:space="0" w:color="000000"/>
+              <w:right w:val="single" w:sz="4" w:space="0" w:color="000000"/>
+            </w:tcBorders>
+          </w:tcPr>
+          <w:p>
+            <w:pPr>
+              <w:pStyle w:val="Compact"/>
+            </w:pPr>
+            <w:r>
+              <w:rPr>
+                <w:rFonts w:ascii="Times New Roman" w:eastAsia="Times New Roman" w:hAnsi="Times New Roman"/>
+                <w:sz w:val="26"/>
+              </w:rPr>
+              <w:t>Vai trò</w:t>
+            </w:r>
+          </w:p>
+        </w:tc>
+      </w:tr>
+      <w:tr>
+        <w:tc>
+          <w:tcPr>
+            <w:tcW w:w="2235" w:type="dxa"/>
+            <w:tcBorders>
+              <w:top w:val="single" w:sz="4" w:space="0" w:color="000000"/>
+              <w:left w:val="single" w:sz="4" w:space="0" w:color="000000"/>
+              <w:bottom w:val="single" w:sz="4" w:space="0" w:color="000000"/>
+              <w:right w:val="single" w:sz="4" w:space="0" w:color="000000"/>
+            </w:tcBorders>
+          </w:tcPr>
+          <w:p>
+            <w:pPr>
+              <w:pStyle w:val="Compact"/>
+            </w:pPr>
+            <w:r>
+              <w:rPr>
+                <w:rFonts w:ascii="Times New Roman" w:eastAsia="Times New Roman" w:hAnsi="Times New Roman"/>
+                <w:sz w:val="26"/>
+              </w:rPr>
+              <w:t>board_config.h</w:t>
+            </w:r>
+          </w:p>
+        </w:tc>
+        <w:tc>
+          <w:tcPr>
+            <w:tcW w:w="6833" w:type="dxa"/>
+            <w:tcBorders>
+              <w:top w:val="single" w:sz="4" w:space="0" w:color="000000"/>
+              <w:left w:val="single" w:sz="4" w:space="0" w:color="000000"/>
+              <w:bottom w:val="single" w:sz="4" w:space="0" w:color="000000"/>
+              <w:right w:val="single" w:sz="4" w:space="0" w:color="000000"/>
+            </w:tcBorders>
+          </w:tcPr>
+          <w:p>
+            <w:pPr>
+              <w:pStyle w:val="Compact"/>
+            </w:pPr>
+            <w:r>
+              <w:rPr>
+                <w:rFonts w:ascii="Times New Roman" w:eastAsia="Times New Roman" w:hAnsi="Times New Roman"/>
+                <w:sz w:val="26"/>
+              </w:rPr>
+              <w:t>Định nghĩa số kênh, chân PA0..PA7, UART PA9/PA10, TIM2, buffer và tốc độ.</w:t>
+            </w:r>
+          </w:p>
+        </w:tc>
+      </w:tr>
+      <w:tr>
+        <w:tc>
+          <w:tcPr>
+            <w:tcW w:w="2235" w:type="dxa"/>
+            <w:tcBorders>
+              <w:top w:val="single" w:sz="4" w:space="0" w:color="000000"/>
+              <w:left w:val="single" w:sz="4" w:space="0" w:color="000000"/>
+              <w:bottom w:val="single" w:sz="4" w:space="0" w:color="000000"/>
+              <w:right w:val="single" w:sz="4" w:space="0" w:color="000000"/>
+            </w:tcBorders>
+          </w:tcPr>
+          <w:p>
+            <w:pPr>
+              <w:pStyle w:val="Compact"/>
+            </w:pPr>
+            <w:r>
+              <w:rPr>
+                <w:rFonts w:ascii="Times New Roman" w:eastAsia="Times New Roman" w:hAnsi="Times New Roman"/>
+                <w:sz w:val="26"/>
+              </w:rPr>
+              <w:t>main.cpp</w:t>
+            </w:r>
+          </w:p>
+        </w:tc>
+        <w:tc>
+          <w:tcPr>
+            <w:tcW w:w="6833" w:type="dxa"/>
+            <w:tcBorders>
+              <w:top w:val="single" w:sz="4" w:space="0" w:color="000000"/>
+              <w:left w:val="single" w:sz="4" w:space="0" w:color="000000"/>
+              <w:bottom w:val="single" w:sz="4" w:space="0" w:color="000000"/>
+              <w:right w:val="single" w:sz="4" w:space="0" w:color="000000"/>
+            </w:tcBorders>
+          </w:tcPr>
+          <w:p>
+            <w:pPr>
+              <w:pStyle w:val="Compact"/>
+            </w:pPr>
+            <w:r>
+              <w:rPr>
+                <w:rFonts w:ascii="Times New Roman" w:eastAsia="Times New Roman" w:hAnsi="Times New Roman"/>
+                <w:sz w:val="26"/>
+              </w:rPr>
+              <w:t>Điều phối UART command, timer, capture state và gửi frame sau capture.</w:t>
+            </w:r>
+          </w:p>
+        </w:tc>
+      </w:tr>
+      <w:tr>
+        <w:tc>
+          <w:tcPr>
+            <w:tcW w:w="2235" w:type="dxa"/>
+            <w:tcBorders>
+              <w:top w:val="single" w:sz="4" w:space="0" w:color="000000"/>
+              <w:left w:val="single" w:sz="4" w:space="0" w:color="000000"/>
+              <w:bottom w:val="single" w:sz="4" w:space="0" w:color="000000"/>
+              <w:right w:val="single" w:sz="4" w:space="0" w:color="000000"/>
+            </w:tcBorders>
+          </w:tcPr>
+          <w:p>
+            <w:pPr>
+              <w:pStyle w:val="Compact"/>
+            </w:pPr>
+            <w:r>
+              <w:rPr>
+                <w:rFonts w:ascii="Times New Roman" w:eastAsia="Times New Roman" w:hAnsi="Times New Roman"/>
+                <w:sz w:val="26"/>
+              </w:rPr>
+              <w:t>la_capture.h/c</w:t>
+            </w:r>
+          </w:p>
+        </w:tc>
+        <w:tc>
+          <w:tcPr>
+            <w:tcW w:w="6833" w:type="dxa"/>
+            <w:tcBorders>
+              <w:top w:val="single" w:sz="4" w:space="0" w:color="000000"/>
+              <w:left w:val="single" w:sz="4" w:space="0" w:color="000000"/>
+              <w:bottom w:val="single" w:sz="4" w:space="0" w:color="000000"/>
+              <w:right w:val="single" w:sz="4" w:space="0" w:color="000000"/>
+            </w:tcBorders>
+          </w:tcPr>
+          <w:p>
+            <w:pPr>
+              <w:pStyle w:val="Compact"/>
+            </w:pPr>
+            <w:r>
+              <w:rPr>
+                <w:rFonts w:ascii="Times New Roman" w:eastAsia="Times New Roman" w:hAnsi="Times New Roman"/>
+                <w:sz w:val="26"/>
+              </w:rPr>
+              <w:t>Quản lý trạng thái capture, pretrigger/posttrigger, trigger và hot path ISR.</w:t>
+            </w:r>
+          </w:p>
+        </w:tc>
+      </w:tr>
+      <w:tr>
+        <w:tc>
+          <w:tcPr>
+            <w:tcW w:w="2235" w:type="dxa"/>
+            <w:tcBorders>
+              <w:top w:val="single" w:sz="4" w:space="0" w:color="000000"/>
+              <w:left w:val="single" w:sz="4" w:space="0" w:color="000000"/>
+              <w:bottom w:val="single" w:sz="4" w:space="0" w:color="000000"/>
+              <w:right w:val="single" w:sz="4" w:space="0" w:color="000000"/>
+            </w:tcBorders>
+          </w:tcPr>
+          <w:p>
+            <w:pPr>
+              <w:pStyle w:val="Compact"/>
+            </w:pPr>
+            <w:r>
+              <w:rPr>
+                <w:rFonts w:ascii="Times New Roman" w:eastAsia="Times New Roman" w:hAnsi="Times New Roman"/>
+                <w:sz w:val="26"/>
+              </w:rPr>
+              <w:t>la_protocol.h/c</w:t>
+            </w:r>
+          </w:p>
+        </w:tc>
+        <w:tc>
+          <w:tcPr>
+            <w:tcW w:w="6833" w:type="dxa"/>
+            <w:tcBorders>
+              <w:top w:val="single" w:sz="4" w:space="0" w:color="000000"/>
+              <w:left w:val="single" w:sz="4" w:space="0" w:color="000000"/>
+              <w:bottom w:val="single" w:sz="4" w:space="0" w:color="000000"/>
+              <w:right w:val="single" w:sz="4" w:space="0" w:color="000000"/>
+            </w:tcBorders>
+          </w:tcPr>
+          <w:p>
+            <w:pPr>
+              <w:pStyle w:val="Compact"/>
+            </w:pPr>
+            <w:r>
+              <w:rPr>
+                <w:rFonts w:ascii="Times New Roman" w:eastAsia="Times New Roman" w:hAnsi="Times New Roman"/>
+                <w:sz w:val="26"/>
+              </w:rPr>
+              <w:t>Tạo header SLA8, checksum và metadata frame.</w:t>
+            </w:r>
+          </w:p>
+        </w:tc>
+      </w:tr>
+      <w:tr>
+        <w:tc>
+          <w:tcPr>
+            <w:tcW w:w="2235" w:type="dxa"/>
+            <w:tcBorders>
+              <w:top w:val="single" w:sz="4" w:space="0" w:color="000000"/>
+              <w:left w:val="single" w:sz="4" w:space="0" w:color="000000"/>
+              <w:bottom w:val="single" w:sz="4" w:space="0" w:color="000000"/>
+              <w:right w:val="single" w:sz="4" w:space="0" w:color="000000"/>
+            </w:tcBorders>
+          </w:tcPr>
+          <w:p>
+            <w:pPr>
+              <w:pStyle w:val="Compact"/>
+            </w:pPr>
+            <w:r>
+              <w:rPr>
+                <w:rFonts w:ascii="Times New Roman" w:eastAsia="Times New Roman" w:hAnsi="Times New Roman"/>
+                <w:sz w:val="26"/>
+              </w:rPr>
+              <w:t>la_benchmark.c</w:t>
+            </w:r>
+          </w:p>
+        </w:tc>
+        <w:tc>
+          <w:tcPr>
+            <w:tcW w:w="6833" w:type="dxa"/>
+            <w:tcBorders>
+              <w:top w:val="single" w:sz="4" w:space="0" w:color="000000"/>
+              <w:left w:val="single" w:sz="4" w:space="0" w:color="000000"/>
+              <w:bottom w:val="single" w:sz="4" w:space="0" w:color="000000"/>
+              <w:right w:val="single" w:sz="4" w:space="0" w:color="000000"/>
+            </w:tcBorders>
+          </w:tcPr>
+          <w:p>
+            <w:pPr>
+              <w:pStyle w:val="Compact"/>
+            </w:pPr>
+            <w:r>
+              <w:rPr>
+                <w:rFonts w:ascii="Times New Roman" w:eastAsia="Times New Roman" w:hAnsi="Times New Roman"/>
+                <w:sz w:val="26"/>
+              </w:rPr>
+              <w:t>Hỗ trợ đo chu kỳ ISR bằng DWT khi build bật benchmark.</w:t>
+            </w:r>
+          </w:p>
+        </w:tc>
+      </w:tr>
+      <w:tr>
+        <w:tc>
+          <w:tcPr>
+            <w:tcW w:w="2235" w:type="dxa"/>
+            <w:tcBorders>
+              <w:top w:val="single" w:sz="4" w:space="0" w:color="000000"/>
+              <w:left w:val="single" w:sz="4" w:space="0" w:color="000000"/>
+              <w:bottom w:val="single" w:sz="4" w:space="0" w:color="000000"/>
+              <w:right w:val="single" w:sz="4" w:space="0" w:color="000000"/>
+            </w:tcBorders>
+          </w:tcPr>
+          <w:p>
+            <w:pPr>
+              <w:pStyle w:val="Compact"/>
+            </w:pPr>
+            <w:r>
+              <w:rPr>
+                <w:rFonts w:ascii="Times New Roman" w:eastAsia="Times New Roman" w:hAnsi="Times New Roman"/>
+                <w:sz w:val="26"/>
+              </w:rPr>
+              <w:t>firmware_v2</w:t>
+            </w:r>
+          </w:p>
+        </w:tc>
+        <w:tc>
+          <w:tcPr>
+            <w:tcW w:w="6833" w:type="dxa"/>
+            <w:tcBorders>
+              <w:top w:val="single" w:sz="4" w:space="0" w:color="000000"/>
+              <w:left w:val="single" w:sz="4" w:space="0" w:color="000000"/>
+              <w:bottom w:val="single" w:sz="4" w:space="0" w:color="000000"/>
+              <w:right w:val="single" w:sz="4" w:space="0" w:color="000000"/>
+            </w:tcBorders>
+          </w:tcPr>
+          <w:p>
+            <w:pPr>
+              <w:pStyle w:val="Compact"/>
+            </w:pPr>
+            <w:r>
+              <w:rPr>
+                <w:rFonts w:ascii="Times New Roman" w:eastAsia="Times New Roman" w:hAnsi="Times New Roman"/>
+                <w:sz w:val="26"/>
+              </w:rPr>
+              <w:t>Nhánh tối ưu ISR/RAM và thử DMA one-shot cho trigger immediate.</w:t>
+            </w:r>
+          </w:p>
+        </w:tc>
+      </w:tr>
+    </w:tbl>
+    <w:p>
+      <w:pPr>
+        <w:pStyle w:val="Heading2"/>
+      </w:pPr>
+      <w:bookmarkStart w:id="18" w:name="_Toc234276609"/>
+      <w:r>
+        <w:t>Luồng hoạt động firmware</w:t>
+      </w:r>
+      <w:bookmarkEnd w:id="18"/>
+      <w:r>
+        <w:rPr>
+          <w:lang w:val="vi-VN"/>
+        </w:rPr>
+        <w:t xml:space="preserve"> </w:t>
+      </w:r>
+      <w:r>
+        <w:rPr>
+          <w:color w:val="FF0000"/>
+          <w:lang w:val="vi-VN"/>
+        </w:rPr>
+        <w:t>Sơ đồ khối hoạt động</w:t>
+      </w:r>
+    </w:p>
+    <w:p>
+      <w:pPr>
+        <w:pStyle w:val="Compact"/>
+      </w:pPr>
+      <w:r>
+        <w:rPr>
+          <w:rFonts w:ascii="Times New Roman" w:eastAsia="Times New Roman" w:hAnsi="Times New Roman"/>
+        </w:rPr>
+        <w:t>Khi khởi động, firmware cấu hình UART, GPIO đầu vào, benchmark và tốc độ lấy mẫu mặc định.</w:t>
+      </w:r>
+    </w:p>
+    <w:p>
+      <w:pPr>
+        <w:pStyle w:val="Compact"/>
+      </w:pPr>
+      <w:r>
+        <w:rPr>
+          <w:rFonts w:ascii="Times New Roman" w:eastAsia="Times New Roman" w:hAnsi="Times New Roman"/>
+        </w:rPr>
+        <w:t>PC gửi lệnh cấu hình như CFG RATE, CFG PRE, CFG POST và TRIG để thiết lập phiên capture.</w:t>
+      </w:r>
+    </w:p>
+    <w:p>
+      <w:pPr>
+        <w:pStyle w:val="Compact"/>
+      </w:pPr>
+      <w:r>
+        <w:rPr>
+          <w:rFonts w:ascii="Times New Roman" w:eastAsia="Times New Roman" w:hAnsi="Times New Roman"/>
+        </w:rPr>
+        <w:t>Khi nhận ARM, firmware cấu hình TIM2 và bắt đầu lấy mẫu theo chu kỳ.</w:t>
+      </w:r>
+    </w:p>
+    <w:p>
+      <w:pPr>
+        <w:pStyle w:val="Compact"/>
+      </w:pPr>
+      <w:r>
+        <w:rPr>
+          <w:rFonts w:ascii="Times New Roman" w:eastAsia="Times New Roman" w:hAnsi="Times New Roman"/>
+        </w:rPr>
+        <w:t>Trong ISR, firmware đọc snapshot GPIOA, cập nhật buffer và trạng thái trigger/posttrigger.</w:t>
+      </w:r>
+    </w:p>
+    <w:p>
+      <w:pPr>
+        <w:pStyle w:val="Compact"/>
+      </w:pPr>
+      <w:r>
+        <w:rPr>
+          <w:rFonts w:ascii="Times New Roman" w:eastAsia="Times New Roman" w:hAnsi="Times New Roman"/>
+        </w:rPr>
+        <w:t>Khi capture hoàn tất, firmware dừng timer, gửi EVENT và chờ PC gửi DUMP để truyền frame SLA8.</w:t>
+      </w:r>
+    </w:p>
+    <w:p>
+      <w:pPr>
+        <w:pStyle w:val="Heading2"/>
+      </w:pPr>
+      <w:bookmarkStart w:id="19" w:name="_Toc234276610"/>
+      <w:r>
+        <w:t>Thiết kế phần mềm PC</w:t>
+      </w:r>
+      <w:bookmarkEnd w:id="19"/>
+    </w:p>
+    <w:p>
+      <w:pPr>
+        <w:pStyle w:val="FirstParagraph"/>
+      </w:pPr>
+      <w:r>
+        <w:rPr>
+          <w:rFonts w:ascii="Times New Roman" w:eastAsia="Times New Roman" w:hAnsi="Times New Roman"/>
+        </w:rPr>
+        <w:t>Phần mềm PC được xây dựng bằng Python, PyQt5 và pyqtgraph. Ứng dụng quản lý kết nối serial, cấu hình phiên capture, nhận frame SLA8, kiểm tra dữ liệu, tách từng kênh từ payload bit-packed và hiển thị waveform. Giao diện cũng cung cấp các điều khiển chọn cổng COM, sample rate, chế độ offline/realtime, trigger và bảng decode.</w:t>
+      </w:r>
+    </w:p>
+    <w:p>
+      <w:pPr>
+        <w:pStyle w:val="Caption"/>
+      </w:pPr>
+      <w:r>
+        <w:rPr>
+          <w:rFonts w:eastAsia="Times New Roman"/>
+        </w:rPr>
+        <w:t xml:space="preserve">Bảng </w:t>
+      </w:r>
+      <w:r>
+        <w:fldChar w:fldCharType="begin"/>
+      </w:r>
+      <w:r>
+        <w:instrText>SEQ Bảng \* ARABIC</w:instrText>
+      </w:r>
+      <w:r>
+        <w:fldChar w:fldCharType="separate"/>
+      </w:r>
+      <w:r>
+        <w:rPr>
+          <w:noProof/>
+        </w:rPr>
+        <w:t>4</w:t>
+      </w:r>
+      <w:r>
+        <w:fldChar w:fldCharType="end"/>
+      </w:r>
+      <w:r>
+        <w:rPr>
+          <w:rFonts w:eastAsia="Times New Roman"/>
+        </w:rPr>
+        <w:t xml:space="preserve"> Chức năng phần mềm PC</w:t>
       </w:r>
     </w:p>
     <w:tbl>
@@ -4314,7 +5113,7 @@
                 <w:rFonts w:ascii="Times New Roman" w:eastAsia="Times New Roman" w:hAnsi="Times New Roman"/>
                 <w:sz w:val="26"/>
               </w:rPr>
-              <w:t>Mô-đun</w:t>
+              <w:t>Chức năng</w:t>
             </w:r>
           </w:p>
         </w:tc>
@@ -4337,7 +5136,7 @@
                 <w:rFonts w:ascii="Times New Roman" w:eastAsia="Times New Roman" w:hAnsi="Times New Roman"/>
                 <w:sz w:val="26"/>
               </w:rPr>
-              <w:t>Vai trò</w:t>
+              <w:t>Mô tả</w:t>
             </w:r>
           </w:p>
         </w:tc>
@@ -4362,7 +5161,7 @@
                 <w:rFonts w:ascii="Times New Roman" w:eastAsia="Times New Roman" w:hAnsi="Times New Roman"/>
                 <w:sz w:val="26"/>
               </w:rPr>
-              <w:t>board_config.h</w:t>
+              <w:t>Kết nối thiết bị</w:t>
             </w:r>
           </w:p>
         </w:tc>
@@ -4385,7 +5184,7 @@
                 <w:rFonts w:ascii="Times New Roman" w:eastAsia="Times New Roman" w:hAnsi="Times New Roman"/>
                 <w:sz w:val="26"/>
               </w:rPr>
-              <w:t>Định nghĩa số kênh, chân PA0..PA7, UART PA9/PA10, TIM2, buffer và tốc độ.</w:t>
+              <w:t>Mở serial, gửi PING, đọc INFO và lấy thông tin buffer/tốc độ.</w:t>
             </w:r>
           </w:p>
         </w:tc>
@@ -4410,7 +5209,7 @@
                 <w:rFonts w:ascii="Times New Roman" w:eastAsia="Times New Roman" w:hAnsi="Times New Roman"/>
                 <w:sz w:val="26"/>
               </w:rPr>
-              <w:t>main.cpp</w:t>
+              <w:t>Capture offline</w:t>
             </w:r>
           </w:p>
         </w:tc>
@@ -4433,7 +5232,7 @@
                 <w:rFonts w:ascii="Times New Roman" w:eastAsia="Times New Roman" w:hAnsi="Times New Roman"/>
                 <w:sz w:val="26"/>
               </w:rPr>
-              <w:t>Điều phối UART command, timer, capture state và gửi frame sau capture.</w:t>
+              <w:t>Gửi ARM, đợi EVENT, gửi DUMP, đọc frame và kiểm tra checksum.</w:t>
             </w:r>
           </w:p>
         </w:tc>
@@ -4458,7 +5257,8 @@
                 <w:rFonts w:ascii="Times New Roman" w:eastAsia="Times New Roman" w:hAnsi="Times New Roman"/>
                 <w:sz w:val="26"/>
               </w:rPr>
-              <w:t>la_capture.h/c</w:t>
+              <w:lastRenderedPageBreak/>
+              <w:t>Hiển thị waveform</w:t>
             </w:r>
           </w:p>
         </w:tc>
@@ -4481,7 +5281,7 @@
                 <w:rFonts w:ascii="Times New Roman" w:eastAsia="Times New Roman" w:hAnsi="Times New Roman"/>
                 <w:sz w:val="26"/>
               </w:rPr>
-              <w:t>Quản lý trạng thái capture, pretrigger/posttrigger, trigger và hot path ISR.</w:t>
+              <w:t>Vẽ 8 kênh, hỗ trợ zoom, fit, scroll và follow live.</w:t>
             </w:r>
           </w:p>
         </w:tc>
@@ -4506,7 +5306,7 @@
                 <w:rFonts w:ascii="Times New Roman" w:eastAsia="Times New Roman" w:hAnsi="Times New Roman"/>
                 <w:sz w:val="26"/>
               </w:rPr>
-              <w:t>la_protocol.h/c</w:t>
+              <w:t>Realtime</w:t>
             </w:r>
           </w:p>
         </w:tc>
@@ -4529,7 +5329,7 @@
                 <w:rFonts w:ascii="Times New Roman" w:eastAsia="Times New Roman" w:hAnsi="Times New Roman"/>
                 <w:sz w:val="26"/>
               </w:rPr>
-              <w:t>Tạo header SLA8, checksum và metadata frame.</w:t>
+              <w:t>Lặp lại offline capture bằng QTimer để cập nhật waveform.</w:t>
             </w:r>
           </w:p>
         </w:tc>
@@ -4554,7 +5354,7 @@
                 <w:rFonts w:ascii="Times New Roman" w:eastAsia="Times New Roman" w:hAnsi="Times New Roman"/>
                 <w:sz w:val="26"/>
               </w:rPr>
-              <w:t>la_benchmark.c</w:t>
+              <w:t>Decode</w:t>
             </w:r>
           </w:p>
         </w:tc>
@@ -4577,7 +5377,7 @@
                 <w:rFonts w:ascii="Times New Roman" w:eastAsia="Times New Roman" w:hAnsi="Times New Roman"/>
                 <w:sz w:val="26"/>
               </w:rPr>
-              <w:t>Hỗ trợ đo chu kỳ ISR bằng DWT khi build bật benchmark.</w:t>
+              <w:t>Hỗ trợ UART và I2C trên capture hiện tại.</w:t>
             </w:r>
           </w:p>
         </w:tc>
@@ -4602,7 +5402,7 @@
                 <w:rFonts w:ascii="Times New Roman" w:eastAsia="Times New Roman" w:hAnsi="Times New Roman"/>
                 <w:sz w:val="26"/>
               </w:rPr>
-              <w:t>firmware_v2</w:t>
+              <w:t>CLI</w:t>
             </w:r>
           </w:p>
         </w:tc>
@@ -4625,7 +5425,7 @@
                 <w:rFonts w:ascii="Times New Roman" w:eastAsia="Times New Roman" w:hAnsi="Times New Roman"/>
                 <w:sz w:val="26"/>
               </w:rPr>
-              <w:t>Nhánh tối ưu ISR/RAM và thử DMA one-shot cho trigger immediate.</w:t>
+              <w:t>Công cụ dòng lệnh hỗ trợ lưu một frame SLA8 để kiểm tra sau capture.</w:t>
             </w:r>
           </w:p>
         </w:tc>
@@ -4635,88 +5435,11 @@
       <w:pPr>
         <w:pStyle w:val="Heading2"/>
       </w:pPr>
-      <w:bookmarkStart w:id="18" w:name="_Toc234276609"/>
-      <w:r>
-        <w:lastRenderedPageBreak/>
-        <w:t>Luồng hoạt động firmware</w:t>
-      </w:r>
-      <w:bookmarkEnd w:id="18"/>
-    </w:p>
-    <w:p>
-      <w:pPr>
-        <w:pStyle w:val="Compact"/>
-      </w:pPr>
-      <w:r>
-        <w:rPr>
-          <w:rFonts w:ascii="Times New Roman" w:eastAsia="Times New Roman" w:hAnsi="Times New Roman"/>
-        </w:rPr>
-        <w:t>Khi khởi động, firmware cấu hình UART, GPIO đầu vào, benchmark và tốc độ lấy mẫu mặc định.</w:t>
-      </w:r>
-    </w:p>
-    <w:p>
-      <w:pPr>
-        <w:pStyle w:val="Compact"/>
-      </w:pPr>
-      <w:r>
-        <w:rPr>
-          <w:rFonts w:ascii="Times New Roman" w:eastAsia="Times New Roman" w:hAnsi="Times New Roman"/>
-        </w:rPr>
-        <w:t>PC gửi lệnh cấu hình như CFG RATE, CFG PRE, CFG POST và TRIG để thiết lập phiên capture.</w:t>
-      </w:r>
-    </w:p>
-    <w:p>
-      <w:pPr>
-        <w:pStyle w:val="Compact"/>
-      </w:pPr>
-      <w:r>
-        <w:rPr>
-          <w:rFonts w:ascii="Times New Roman" w:eastAsia="Times New Roman" w:hAnsi="Times New Roman"/>
-        </w:rPr>
-        <w:t>Khi nhận ARM, firmware cấu hình TIM2 và bắt đầu lấy mẫu theo chu kỳ.</w:t>
-      </w:r>
-    </w:p>
-    <w:p>
-      <w:pPr>
-        <w:pStyle w:val="Compact"/>
-      </w:pPr>
-      <w:r>
-        <w:rPr>
-          <w:rFonts w:ascii="Times New Roman" w:eastAsia="Times New Roman" w:hAnsi="Times New Roman"/>
-        </w:rPr>
-        <w:t>Trong ISR, firmware đọc snapshot GPIOA, cập nhật buffer và trạng thái trigger/posttrigger.</w:t>
-      </w:r>
-    </w:p>
-    <w:p>
-      <w:pPr>
-        <w:pStyle w:val="Compact"/>
-      </w:pPr>
-      <w:r>
-        <w:rPr>
-          <w:rFonts w:ascii="Times New Roman" w:eastAsia="Times New Roman" w:hAnsi="Times New Roman"/>
-        </w:rPr>
-        <w:t>Khi capture hoàn tất, firmware dừng timer, gửi EVENT và chờ PC gửi DUMP để truyền frame SLA8.</w:t>
-      </w:r>
-    </w:p>
-    <w:p>
-      <w:pPr>
-        <w:pStyle w:val="Heading2"/>
-      </w:pPr>
-      <w:bookmarkStart w:id="19" w:name="_Toc234276610"/>
-      <w:r>
-        <w:t>Thiết kế phần mềm PC</w:t>
-      </w:r>
-      <w:bookmarkEnd w:id="19"/>
-    </w:p>
-    <w:p>
-      <w:pPr>
-        <w:pStyle w:val="FirstParagraph"/>
-      </w:pPr>
-      <w:r>
-        <w:rPr>
-          <w:rFonts w:ascii="Times New Roman" w:eastAsia="Times New Roman" w:hAnsi="Times New Roman"/>
-        </w:rPr>
-        <w:t>Phần mềm PC được xây dựng bằng Python, PyQt5 và pyqtgraph. Ứng dụng quản lý kết nối serial, cấu hình phiên capture, nhận frame SLA8, kiểm tra dữ liệu, tách từng kênh từ payload bit-packed và hiển thị waveform. Giao diện cũng cung cấp các điều khiển chọn cổng COM, sample rate, chế độ offline/realtime, trigger và bảng decode.</w:t>
-      </w:r>
+      <w:bookmarkStart w:id="20" w:name="_Toc234276611"/>
+      <w:r>
+        <w:t>Giao thức điều khiển</w:t>
+      </w:r>
+      <w:bookmarkEnd w:id="20"/>
     </w:p>
     <w:p>
       <w:pPr>
@@ -4741,7 +5464,7 @@
         <w:rPr>
           <w:noProof/>
         </w:rPr>
-        <w:t>4</w:t>
+        <w:t>5</w:t>
       </w:r>
       <w:r>
         <w:fldChar w:fldCharType="end"/>
@@ -4750,7 +5473,7 @@
         <w:rPr>
           <w:rFonts w:eastAsia="Times New Roman"/>
         </w:rPr>
-        <w:t xml:space="preserve"> Chức năng phần mềm PC</w:t>
+        <w:t xml:space="preserve"> Các lệnh UART chính</w:t>
       </w:r>
     </w:p>
     <w:tbl>
@@ -4791,7 +5514,7 @@
                 <w:rFonts w:ascii="Times New Roman" w:eastAsia="Times New Roman" w:hAnsi="Times New Roman"/>
                 <w:sz w:val="26"/>
               </w:rPr>
-              <w:t>Chức năng</w:t>
+              <w:t>Lệnh</w:t>
             </w:r>
           </w:p>
         </w:tc>
@@ -4814,7 +5537,7 @@
                 <w:rFonts w:ascii="Times New Roman" w:eastAsia="Times New Roman" w:hAnsi="Times New Roman"/>
                 <w:sz w:val="26"/>
               </w:rPr>
-              <w:t>Mô tả</w:t>
+              <w:t>Ý nghĩa</w:t>
             </w:r>
           </w:p>
         </w:tc>
@@ -4839,7 +5562,7 @@
                 <w:rFonts w:ascii="Times New Roman" w:eastAsia="Times New Roman" w:hAnsi="Times New Roman"/>
                 <w:sz w:val="26"/>
               </w:rPr>
-              <w:t>Kết nối thiết bị</w:t>
+              <w:t>PING</w:t>
             </w:r>
           </w:p>
         </w:tc>
@@ -4862,7 +5585,7 @@
                 <w:rFonts w:ascii="Times New Roman" w:eastAsia="Times New Roman" w:hAnsi="Times New Roman"/>
                 <w:sz w:val="26"/>
               </w:rPr>
-              <w:t>Mở serial, gửi PING, đọc INFO và lấy thông tin buffer/tốc độ.</w:t>
+              <w:t>Kiểm tra thiết bị, phản hồi PONG SLA8.</w:t>
             </w:r>
           </w:p>
         </w:tc>
@@ -4887,7 +5610,7 @@
                 <w:rFonts w:ascii="Times New Roman" w:eastAsia="Times New Roman" w:hAnsi="Times New Roman"/>
                 <w:sz w:val="26"/>
               </w:rPr>
-              <w:t>Capture offline</w:t>
+              <w:t>INFO</w:t>
             </w:r>
           </w:p>
         </w:tc>
@@ -4910,7 +5633,7 @@
                 <w:rFonts w:ascii="Times New Roman" w:eastAsia="Times New Roman" w:hAnsi="Times New Roman"/>
                 <w:sz w:val="26"/>
               </w:rPr>
-              <w:t>Gửi ARM, đợi EVENT, gửi DUMP, đọc frame và kiểm tra checksum.</w:t>
+              <w:t>In version, số kênh, buffer, default/max rate và thông tin capture.</w:t>
             </w:r>
           </w:p>
         </w:tc>
@@ -4935,7 +5658,7 @@
                 <w:rFonts w:ascii="Times New Roman" w:eastAsia="Times New Roman" w:hAnsi="Times New Roman"/>
                 <w:sz w:val="26"/>
               </w:rPr>
-              <w:t>Hiển thị waveform</w:t>
+              <w:t>STATUS</w:t>
             </w:r>
           </w:p>
         </w:tc>
@@ -4958,7 +5681,7 @@
                 <w:rFonts w:ascii="Times New Roman" w:eastAsia="Times New Roman" w:hAnsi="Times New Roman"/>
                 <w:sz w:val="26"/>
               </w:rPr>
-              <w:t>Vẽ 8 kênh, hỗ trợ zoom, fit, scroll và follow live.</w:t>
+              <w:t>In trạng thái capture, actual rate, số mẫu, overflow và dropped samples.</w:t>
             </w:r>
           </w:p>
         </w:tc>
@@ -4983,7 +5706,7 @@
                 <w:rFonts w:ascii="Times New Roman" w:eastAsia="Times New Roman" w:hAnsi="Times New Roman"/>
                 <w:sz w:val="26"/>
               </w:rPr>
-              <w:t>Realtime</w:t>
+              <w:t>CFG RATE &lt;Hz&gt;</w:t>
             </w:r>
           </w:p>
         </w:tc>
@@ -5006,7 +5729,7 @@
                 <w:rFonts w:ascii="Times New Roman" w:eastAsia="Times New Roman" w:hAnsi="Times New Roman"/>
                 <w:sz w:val="26"/>
               </w:rPr>
-              <w:t>Lặp lại offline capture bằng QTimer để cập nhật waveform.</w:t>
+              <w:t>Cấu hình tốc độ lấy mẫu.</w:t>
             </w:r>
           </w:p>
         </w:tc>
@@ -5031,7 +5754,7 @@
                 <w:rFonts w:ascii="Times New Roman" w:eastAsia="Times New Roman" w:hAnsi="Times New Roman"/>
                 <w:sz w:val="26"/>
               </w:rPr>
-              <w:t>Decode</w:t>
+              <w:t>TRIG IMM/RISE/FALL/ANY/PAT</w:t>
             </w:r>
           </w:p>
         </w:tc>
@@ -5054,7 +5777,7 @@
                 <w:rFonts w:ascii="Times New Roman" w:eastAsia="Times New Roman" w:hAnsi="Times New Roman"/>
                 <w:sz w:val="26"/>
               </w:rPr>
-              <w:t>Hỗ trợ UART và I2C trên capture hiện tại.</w:t>
+              <w:t>Cấu hình điều kiện trigger.</w:t>
             </w:r>
           </w:p>
         </w:tc>
@@ -5079,7 +5802,7 @@
                 <w:rFonts w:ascii="Times New Roman" w:eastAsia="Times New Roman" w:hAnsi="Times New Roman"/>
                 <w:sz w:val="26"/>
               </w:rPr>
-              <w:t>CLI</w:t>
+              <w:t>ARM</w:t>
             </w:r>
           </w:p>
         </w:tc>
@@ -5102,7 +5825,55 @@
                 <w:rFonts w:ascii="Times New Roman" w:eastAsia="Times New Roman" w:hAnsi="Times New Roman"/>
                 <w:sz w:val="26"/>
               </w:rPr>
-              <w:t>Công cụ dòng lệnh hỗ trợ lưu một frame SLA8 để kiểm tra sau capture.</w:t>
+              <w:t>Bắt đầu phiên capture.</w:t>
+            </w:r>
+          </w:p>
+        </w:tc>
+      </w:tr>
+      <w:tr>
+        <w:tc>
+          <w:tcPr>
+            <w:tcW w:w="4534" w:type="dxa"/>
+            <w:tcBorders>
+              <w:top w:val="single" w:sz="4" w:space="0" w:color="000000"/>
+              <w:left w:val="single" w:sz="4" w:space="0" w:color="000000"/>
+              <w:bottom w:val="single" w:sz="4" w:space="0" w:color="000000"/>
+              <w:right w:val="single" w:sz="4" w:space="0" w:color="000000"/>
+            </w:tcBorders>
+          </w:tcPr>
+          <w:p>
+            <w:pPr>
+              <w:pStyle w:val="Compact"/>
+            </w:pPr>
+            <w:r>
+              <w:rPr>
+                <w:rFonts w:ascii="Times New Roman" w:eastAsia="Times New Roman" w:hAnsi="Times New Roman"/>
+                <w:sz w:val="26"/>
+              </w:rPr>
+              <w:t>DUMP</w:t>
+            </w:r>
+          </w:p>
+        </w:tc>
+        <w:tc>
+          <w:tcPr>
+            <w:tcW w:w="4534" w:type="dxa"/>
+            <w:tcBorders>
+              <w:top w:val="single" w:sz="4" w:space="0" w:color="000000"/>
+              <w:left w:val="single" w:sz="4" w:space="0" w:color="000000"/>
+              <w:bottom w:val="single" w:sz="4" w:space="0" w:color="000000"/>
+              <w:right w:val="single" w:sz="4" w:space="0" w:color="000000"/>
+            </w:tcBorders>
+          </w:tcPr>
+          <w:p>
+            <w:pPr>
+              <w:pStyle w:val="Compact"/>
+            </w:pPr>
+            <w:r>
+              <w:rPr>
+                <w:rFonts w:ascii="Times New Roman" w:eastAsia="Times New Roman" w:hAnsi="Times New Roman"/>
+                <w:sz w:val="26"/>
+              </w:rPr>
+              <w:t>Truyền frame SLA8 sau khi capture kết thúc.</w:t>
             </w:r>
           </w:p>
         </w:tc>
@@ -5112,496 +5883,100 @@
       <w:pPr>
         <w:pStyle w:val="Heading2"/>
       </w:pPr>
-      <w:bookmarkStart w:id="20" w:name="_Toc234276611"/>
-      <w:r>
-        <w:t>Giao thức điều khiển</w:t>
-      </w:r>
-      <w:bookmarkEnd w:id="20"/>
-    </w:p>
-    <w:p>
-      <w:pPr>
-        <w:pStyle w:val="Caption"/>
-      </w:pPr>
-      <w:r>
-        <w:rPr>
-          <w:rFonts w:eastAsia="Times New Roman"/>
-        </w:rPr>
-        <w:t xml:space="preserve">Bảng </w:t>
-      </w:r>
-      <w:r>
-        <w:fldChar w:fldCharType="begin"/>
-      </w:r>
-      <w:r>
-        <w:instrText>SEQ Bảng \* ARABIC</w:instrText>
-      </w:r>
-      <w:r>
-        <w:fldChar w:fldCharType="separate"/>
-      </w:r>
-      <w:r>
-        <w:rPr>
-          <w:noProof/>
-        </w:rPr>
-        <w:t>5</w:t>
-      </w:r>
-      <w:r>
-        <w:fldChar w:fldCharType="end"/>
-      </w:r>
-      <w:r>
-        <w:rPr>
-          <w:rFonts w:eastAsia="Times New Roman"/>
-        </w:rPr>
-        <w:t xml:space="preserve"> Các lệnh UART chính</w:t>
-      </w:r>
-    </w:p>
-    <w:tbl>
-      <w:tblPr>
-        <w:tblStyle w:val="TableGrid"/>
-        <w:tblW w:w="0" w:type="auto"/>
-        <w:tblBorders>
-          <w:top w:val="single" w:sz="4" w:space="0" w:color="000000"/>
-          <w:left w:val="single" w:sz="4" w:space="0" w:color="000000"/>
-          <w:bottom w:val="single" w:sz="4" w:space="0" w:color="000000"/>
-          <w:right w:val="single" w:sz="4" w:space="0" w:color="000000"/>
-          <w:insideH w:val="single" w:sz="4" w:space="0" w:color="000000"/>
-          <w:insideV w:val="single" w:sz="4" w:space="0" w:color="000000"/>
-        </w:tblBorders>
-        <w:tblLook w:val="04A0" w:firstRow="1" w:lastRow="0" w:firstColumn="1" w:lastColumn="0" w:noHBand="0" w:noVBand="1"/>
-      </w:tblPr>
-      <w:tblGrid>
-        <w:gridCol w:w="4534"/>
-        <w:gridCol w:w="4534"/>
-      </w:tblGrid>
-      <w:tr>
-        <w:tc>
-          <w:tcPr>
-            <w:tcW w:w="4534" w:type="dxa"/>
-            <w:tcBorders>
-              <w:top w:val="single" w:sz="4" w:space="0" w:color="000000"/>
-              <w:left w:val="single" w:sz="4" w:space="0" w:color="000000"/>
-              <w:bottom w:val="single" w:sz="4" w:space="0" w:color="000000"/>
-              <w:right w:val="single" w:sz="4" w:space="0" w:color="000000"/>
-            </w:tcBorders>
-          </w:tcPr>
-          <w:p>
-            <w:pPr>
-              <w:pStyle w:val="Compact"/>
-            </w:pPr>
-            <w:r>
-              <w:rPr>
-                <w:rFonts w:ascii="Times New Roman" w:eastAsia="Times New Roman" w:hAnsi="Times New Roman"/>
-                <w:sz w:val="26"/>
-              </w:rPr>
-              <w:t>Lệnh</w:t>
-            </w:r>
-          </w:p>
-        </w:tc>
-        <w:tc>
-          <w:tcPr>
-            <w:tcW w:w="4534" w:type="dxa"/>
-            <w:tcBorders>
-              <w:top w:val="single" w:sz="4" w:space="0" w:color="000000"/>
-              <w:left w:val="single" w:sz="4" w:space="0" w:color="000000"/>
-              <w:bottom w:val="single" w:sz="4" w:space="0" w:color="000000"/>
-              <w:right w:val="single" w:sz="4" w:space="0" w:color="000000"/>
-            </w:tcBorders>
-          </w:tcPr>
-          <w:p>
-            <w:pPr>
-              <w:pStyle w:val="Compact"/>
-            </w:pPr>
-            <w:r>
-              <w:rPr>
-                <w:rFonts w:ascii="Times New Roman" w:eastAsia="Times New Roman" w:hAnsi="Times New Roman"/>
-                <w:sz w:val="26"/>
-              </w:rPr>
-              <w:t>Ý nghĩa</w:t>
-            </w:r>
-          </w:p>
-        </w:tc>
-      </w:tr>
-      <w:tr>
-        <w:tc>
-          <w:tcPr>
-            <w:tcW w:w="4534" w:type="dxa"/>
-            <w:tcBorders>
-              <w:top w:val="single" w:sz="4" w:space="0" w:color="000000"/>
-              <w:left w:val="single" w:sz="4" w:space="0" w:color="000000"/>
-              <w:bottom w:val="single" w:sz="4" w:space="0" w:color="000000"/>
-              <w:right w:val="single" w:sz="4" w:space="0" w:color="000000"/>
-            </w:tcBorders>
-          </w:tcPr>
-          <w:p>
-            <w:pPr>
-              <w:pStyle w:val="Compact"/>
-            </w:pPr>
-            <w:r>
-              <w:rPr>
-                <w:rFonts w:ascii="Times New Roman" w:eastAsia="Times New Roman" w:hAnsi="Times New Roman"/>
-                <w:sz w:val="26"/>
-              </w:rPr>
-              <w:t>PING</w:t>
-            </w:r>
-          </w:p>
-        </w:tc>
-        <w:tc>
-          <w:tcPr>
-            <w:tcW w:w="4534" w:type="dxa"/>
-            <w:tcBorders>
-              <w:top w:val="single" w:sz="4" w:space="0" w:color="000000"/>
-              <w:left w:val="single" w:sz="4" w:space="0" w:color="000000"/>
-              <w:bottom w:val="single" w:sz="4" w:space="0" w:color="000000"/>
-              <w:right w:val="single" w:sz="4" w:space="0" w:color="000000"/>
-            </w:tcBorders>
-          </w:tcPr>
-          <w:p>
-            <w:pPr>
-              <w:pStyle w:val="Compact"/>
-            </w:pPr>
-            <w:r>
-              <w:rPr>
-                <w:rFonts w:ascii="Times New Roman" w:eastAsia="Times New Roman" w:hAnsi="Times New Roman"/>
-                <w:sz w:val="26"/>
-              </w:rPr>
-              <w:t>Kiểm tra thiết bị, phản hồi PONG SLA8.</w:t>
-            </w:r>
-          </w:p>
-        </w:tc>
-      </w:tr>
-      <w:tr>
-        <w:tc>
-          <w:tcPr>
-            <w:tcW w:w="4534" w:type="dxa"/>
-            <w:tcBorders>
-              <w:top w:val="single" w:sz="4" w:space="0" w:color="000000"/>
-              <w:left w:val="single" w:sz="4" w:space="0" w:color="000000"/>
-              <w:bottom w:val="single" w:sz="4" w:space="0" w:color="000000"/>
-              <w:right w:val="single" w:sz="4" w:space="0" w:color="000000"/>
-            </w:tcBorders>
-          </w:tcPr>
-          <w:p>
-            <w:pPr>
-              <w:pStyle w:val="Compact"/>
-            </w:pPr>
-            <w:r>
-              <w:rPr>
-                <w:rFonts w:ascii="Times New Roman" w:eastAsia="Times New Roman" w:hAnsi="Times New Roman"/>
-                <w:sz w:val="26"/>
-              </w:rPr>
-              <w:t>INFO</w:t>
-            </w:r>
-          </w:p>
-        </w:tc>
-        <w:tc>
-          <w:tcPr>
-            <w:tcW w:w="4534" w:type="dxa"/>
-            <w:tcBorders>
-              <w:top w:val="single" w:sz="4" w:space="0" w:color="000000"/>
-              <w:left w:val="single" w:sz="4" w:space="0" w:color="000000"/>
-              <w:bottom w:val="single" w:sz="4" w:space="0" w:color="000000"/>
-              <w:right w:val="single" w:sz="4" w:space="0" w:color="000000"/>
-            </w:tcBorders>
-          </w:tcPr>
-          <w:p>
-            <w:pPr>
-              <w:pStyle w:val="Compact"/>
-            </w:pPr>
-            <w:r>
-              <w:rPr>
-                <w:rFonts w:ascii="Times New Roman" w:eastAsia="Times New Roman" w:hAnsi="Times New Roman"/>
-                <w:sz w:val="26"/>
-              </w:rPr>
-              <w:t>In version, số kênh, buffer, default/max rate và thông tin capture.</w:t>
-            </w:r>
-          </w:p>
-        </w:tc>
-      </w:tr>
-      <w:tr>
-        <w:tc>
-          <w:tcPr>
-            <w:tcW w:w="4534" w:type="dxa"/>
-            <w:tcBorders>
-              <w:top w:val="single" w:sz="4" w:space="0" w:color="000000"/>
-              <w:left w:val="single" w:sz="4" w:space="0" w:color="000000"/>
-              <w:bottom w:val="single" w:sz="4" w:space="0" w:color="000000"/>
-              <w:right w:val="single" w:sz="4" w:space="0" w:color="000000"/>
-            </w:tcBorders>
-          </w:tcPr>
-          <w:p>
-            <w:pPr>
-              <w:pStyle w:val="Compact"/>
-            </w:pPr>
-            <w:r>
-              <w:rPr>
-                <w:rFonts w:ascii="Times New Roman" w:eastAsia="Times New Roman" w:hAnsi="Times New Roman"/>
-                <w:sz w:val="26"/>
-              </w:rPr>
-              <w:t>STATUS</w:t>
-            </w:r>
-          </w:p>
-        </w:tc>
-        <w:tc>
-          <w:tcPr>
-            <w:tcW w:w="4534" w:type="dxa"/>
-            <w:tcBorders>
-              <w:top w:val="single" w:sz="4" w:space="0" w:color="000000"/>
-              <w:left w:val="single" w:sz="4" w:space="0" w:color="000000"/>
-              <w:bottom w:val="single" w:sz="4" w:space="0" w:color="000000"/>
-              <w:right w:val="single" w:sz="4" w:space="0" w:color="000000"/>
-            </w:tcBorders>
-          </w:tcPr>
-          <w:p>
-            <w:pPr>
-              <w:pStyle w:val="Compact"/>
-            </w:pPr>
-            <w:r>
-              <w:rPr>
-                <w:rFonts w:ascii="Times New Roman" w:eastAsia="Times New Roman" w:hAnsi="Times New Roman"/>
-                <w:sz w:val="26"/>
-              </w:rPr>
-              <w:t xml:space="preserve">In trạng thái capture, actual rate, số mẫu, </w:t>
-            </w:r>
-            <w:r>
-              <w:rPr>
-                <w:rFonts w:ascii="Times New Roman" w:eastAsia="Times New Roman" w:hAnsi="Times New Roman"/>
-                <w:sz w:val="26"/>
-              </w:rPr>
-              <w:lastRenderedPageBreak/>
-              <w:t>overflow và dropped samples.</w:t>
-            </w:r>
-          </w:p>
-        </w:tc>
-      </w:tr>
-      <w:tr>
-        <w:tc>
-          <w:tcPr>
-            <w:tcW w:w="4534" w:type="dxa"/>
-            <w:tcBorders>
-              <w:top w:val="single" w:sz="4" w:space="0" w:color="000000"/>
-              <w:left w:val="single" w:sz="4" w:space="0" w:color="000000"/>
-              <w:bottom w:val="single" w:sz="4" w:space="0" w:color="000000"/>
-              <w:right w:val="single" w:sz="4" w:space="0" w:color="000000"/>
-            </w:tcBorders>
-          </w:tcPr>
-          <w:p>
-            <w:pPr>
-              <w:pStyle w:val="Compact"/>
-            </w:pPr>
-            <w:r>
-              <w:rPr>
-                <w:rFonts w:ascii="Times New Roman" w:eastAsia="Times New Roman" w:hAnsi="Times New Roman"/>
-                <w:sz w:val="26"/>
-              </w:rPr>
-              <w:lastRenderedPageBreak/>
-              <w:t>CFG RATE &lt;Hz&gt;</w:t>
-            </w:r>
-          </w:p>
-        </w:tc>
-        <w:tc>
-          <w:tcPr>
-            <w:tcW w:w="4534" w:type="dxa"/>
-            <w:tcBorders>
-              <w:top w:val="single" w:sz="4" w:space="0" w:color="000000"/>
-              <w:left w:val="single" w:sz="4" w:space="0" w:color="000000"/>
-              <w:bottom w:val="single" w:sz="4" w:space="0" w:color="000000"/>
-              <w:right w:val="single" w:sz="4" w:space="0" w:color="000000"/>
-            </w:tcBorders>
-          </w:tcPr>
-          <w:p>
-            <w:pPr>
-              <w:pStyle w:val="Compact"/>
-            </w:pPr>
-            <w:r>
-              <w:rPr>
-                <w:rFonts w:ascii="Times New Roman" w:eastAsia="Times New Roman" w:hAnsi="Times New Roman"/>
-                <w:sz w:val="26"/>
-              </w:rPr>
-              <w:t>Cấu hình tốc độ lấy mẫu.</w:t>
-            </w:r>
-          </w:p>
-        </w:tc>
-      </w:tr>
-      <w:tr>
-        <w:tc>
-          <w:tcPr>
-            <w:tcW w:w="4534" w:type="dxa"/>
-            <w:tcBorders>
-              <w:top w:val="single" w:sz="4" w:space="0" w:color="000000"/>
-              <w:left w:val="single" w:sz="4" w:space="0" w:color="000000"/>
-              <w:bottom w:val="single" w:sz="4" w:space="0" w:color="000000"/>
-              <w:right w:val="single" w:sz="4" w:space="0" w:color="000000"/>
-            </w:tcBorders>
-          </w:tcPr>
-          <w:p>
-            <w:pPr>
-              <w:pStyle w:val="Compact"/>
-            </w:pPr>
-            <w:r>
-              <w:rPr>
-                <w:rFonts w:ascii="Times New Roman" w:eastAsia="Times New Roman" w:hAnsi="Times New Roman"/>
-                <w:sz w:val="26"/>
-              </w:rPr>
-              <w:t>TRIG IMM/RISE/FALL/ANY/PAT</w:t>
-            </w:r>
-          </w:p>
-        </w:tc>
-        <w:tc>
-          <w:tcPr>
-            <w:tcW w:w="4534" w:type="dxa"/>
-            <w:tcBorders>
-              <w:top w:val="single" w:sz="4" w:space="0" w:color="000000"/>
-              <w:left w:val="single" w:sz="4" w:space="0" w:color="000000"/>
-              <w:bottom w:val="single" w:sz="4" w:space="0" w:color="000000"/>
-              <w:right w:val="single" w:sz="4" w:space="0" w:color="000000"/>
-            </w:tcBorders>
-          </w:tcPr>
-          <w:p>
-            <w:pPr>
-              <w:pStyle w:val="Compact"/>
-            </w:pPr>
-            <w:r>
-              <w:rPr>
-                <w:rFonts w:ascii="Times New Roman" w:eastAsia="Times New Roman" w:hAnsi="Times New Roman"/>
-                <w:sz w:val="26"/>
-              </w:rPr>
-              <w:t>Cấu hình điều kiện trigger.</w:t>
-            </w:r>
-          </w:p>
-        </w:tc>
-      </w:tr>
-      <w:tr>
-        <w:tc>
-          <w:tcPr>
-            <w:tcW w:w="4534" w:type="dxa"/>
-            <w:tcBorders>
-              <w:top w:val="single" w:sz="4" w:space="0" w:color="000000"/>
-              <w:left w:val="single" w:sz="4" w:space="0" w:color="000000"/>
-              <w:bottom w:val="single" w:sz="4" w:space="0" w:color="000000"/>
-              <w:right w:val="single" w:sz="4" w:space="0" w:color="000000"/>
-            </w:tcBorders>
-          </w:tcPr>
-          <w:p>
-            <w:pPr>
-              <w:pStyle w:val="Compact"/>
-            </w:pPr>
-            <w:r>
-              <w:rPr>
-                <w:rFonts w:ascii="Times New Roman" w:eastAsia="Times New Roman" w:hAnsi="Times New Roman"/>
-                <w:sz w:val="26"/>
-              </w:rPr>
-              <w:t>ARM</w:t>
-            </w:r>
-          </w:p>
-        </w:tc>
-        <w:tc>
-          <w:tcPr>
-            <w:tcW w:w="4534" w:type="dxa"/>
-            <w:tcBorders>
-              <w:top w:val="single" w:sz="4" w:space="0" w:color="000000"/>
-              <w:left w:val="single" w:sz="4" w:space="0" w:color="000000"/>
-              <w:bottom w:val="single" w:sz="4" w:space="0" w:color="000000"/>
-              <w:right w:val="single" w:sz="4" w:space="0" w:color="000000"/>
-            </w:tcBorders>
-          </w:tcPr>
-          <w:p>
-            <w:pPr>
-              <w:pStyle w:val="Compact"/>
-            </w:pPr>
-            <w:r>
-              <w:rPr>
-                <w:rFonts w:ascii="Times New Roman" w:eastAsia="Times New Roman" w:hAnsi="Times New Roman"/>
-                <w:sz w:val="26"/>
-              </w:rPr>
-              <w:t>Bắt đầu phiên capture.</w:t>
-            </w:r>
-          </w:p>
-        </w:tc>
-      </w:tr>
-      <w:tr>
-        <w:tc>
-          <w:tcPr>
-            <w:tcW w:w="4534" w:type="dxa"/>
-            <w:tcBorders>
-              <w:top w:val="single" w:sz="4" w:space="0" w:color="000000"/>
-              <w:left w:val="single" w:sz="4" w:space="0" w:color="000000"/>
-              <w:bottom w:val="single" w:sz="4" w:space="0" w:color="000000"/>
-              <w:right w:val="single" w:sz="4" w:space="0" w:color="000000"/>
-            </w:tcBorders>
-          </w:tcPr>
-          <w:p>
-            <w:pPr>
-              <w:pStyle w:val="Compact"/>
-            </w:pPr>
-            <w:r>
-              <w:rPr>
-                <w:rFonts w:ascii="Times New Roman" w:eastAsia="Times New Roman" w:hAnsi="Times New Roman"/>
-                <w:sz w:val="26"/>
-              </w:rPr>
-              <w:t>DUMP</w:t>
-            </w:r>
-          </w:p>
-        </w:tc>
-        <w:tc>
-          <w:tcPr>
-            <w:tcW w:w="4534" w:type="dxa"/>
-            <w:tcBorders>
-              <w:top w:val="single" w:sz="4" w:space="0" w:color="000000"/>
-              <w:left w:val="single" w:sz="4" w:space="0" w:color="000000"/>
-              <w:bottom w:val="single" w:sz="4" w:space="0" w:color="000000"/>
-              <w:right w:val="single" w:sz="4" w:space="0" w:color="000000"/>
-            </w:tcBorders>
-          </w:tcPr>
-          <w:p>
-            <w:pPr>
-              <w:pStyle w:val="Compact"/>
-            </w:pPr>
-            <w:r>
-              <w:rPr>
-                <w:rFonts w:ascii="Times New Roman" w:eastAsia="Times New Roman" w:hAnsi="Times New Roman"/>
-                <w:sz w:val="26"/>
-              </w:rPr>
-              <w:t>Truyền frame SLA8 sau khi capture kết thúc.</w:t>
-            </w:r>
-          </w:p>
-        </w:tc>
-      </w:tr>
-    </w:tbl>
+      <w:bookmarkStart w:id="21" w:name="_Toc234276612"/>
+      <w:r>
+        <w:t>Công cụ tạo tín hiệu thử</w:t>
+      </w:r>
+      <w:bookmarkEnd w:id="21"/>
+    </w:p>
+    <w:p>
+      <w:pPr>
+        <w:pStyle w:val="FirstParagraph"/>
+        <w:rPr>
+          <w:rFonts w:ascii="Times New Roman" w:eastAsia="Times New Roman" w:hAnsi="Times New Roman"/>
+          <w:lang w:val="vi-VN"/>
+        </w:rPr>
+      </w:pPr>
+      <w:r>
+        <w:rPr>
+          <w:rFonts w:ascii="Times New Roman" w:eastAsia="Times New Roman" w:hAnsi="Times New Roman"/>
+        </w:rPr>
+        <w:t>Bộ tạo tín hiệu thử sử dụng Arduino UNO để phát các dạng tín hiệu phục vụ kiểm tra, gồm xung tuần hoàn, UART bit-bang và I2C dạng open-drain. Khối này phù hợp để tạo dữ liệu đầu vào cho việc quan sát waveform và kiểm tra decoder; kết quả chạy thực nghiệm cần được bổ sung bằng ảnh chụp hoặc log sau khi đo trên phần cứng.</w:t>
+      </w:r>
+    </w:p>
+    <w:p>
+      <w:pPr>
+        <w:pStyle w:val="BodyText"/>
+        <w:rPr>
+          <w:color w:val="FF0000"/>
+          <w:lang w:val="vi-VN"/>
+        </w:rPr>
+      </w:pPr>
+      <w:r>
+        <w:rPr>
+          <w:color w:val="FF0000"/>
+          <w:lang w:val="vi-VN"/>
+        </w:rPr>
+        <w:t>3.8 Thiết kế Khối mạch bảo vệ</w:t>
+      </w:r>
+    </w:p>
+    <w:p>
+      <w:pPr>
+        <w:pStyle w:val="Heading1"/>
+        <w:rPr>
+          <w:lang w:val="vi-VN"/>
+        </w:rPr>
+      </w:pPr>
+      <w:bookmarkStart w:id="22" w:name="_Toc234276613"/>
+      <w:r>
+        <w:t>TRIỂN KHAI VÀ KIỂM THỬ</w:t>
+      </w:r>
+      <w:bookmarkEnd w:id="22"/>
+    </w:p>
+    <w:p>
+      <w:pPr>
+        <w:rPr>
+          <w:color w:val="FF0000"/>
+          <w:lang w:val="vi-VN"/>
+        </w:rPr>
+      </w:pPr>
+      <w:r>
+        <w:rPr>
+          <w:color w:val="FF0000"/>
+          <w:lang w:val="vi-VN"/>
+        </w:rPr>
+        <w:t>Cách cắm mạch, nối dây, chạy file gì để làm chương trình, thao tác như nào</w:t>
+      </w:r>
+    </w:p>
+    <w:p>
+      <w:pPr>
+        <w:rPr>
+          <w:color w:val="FF0000"/>
+          <w:lang w:val="vi-VN"/>
+        </w:rPr>
+      </w:pPr>
+      <w:r>
+        <w:rPr>
+          <w:color w:val="FF0000"/>
+          <w:lang w:val="vi-VN"/>
+        </w:rPr>
+        <w:t xml:space="preserve">Khi cap ảnh </w:t>
+      </w:r>
+      <w:r>
+        <w:rPr>
+          <w:color w:val="FF0000"/>
+          <w:lang w:val="vi-VN"/>
+        </w:rPr>
+        <w:t>decode, cap rõ phần start bit, stop bit đối với UART để chèn ảnh vào và chú thích khoanh vùng phần đó (MISO, MOSI)</w:t>
+      </w:r>
+    </w:p>
     <w:p>
       <w:pPr>
         <w:pStyle w:val="Heading2"/>
       </w:pPr>
-      <w:bookmarkStart w:id="21" w:name="_Toc234276612"/>
-      <w:r>
-        <w:t>Công cụ tạo tín hiệu thử</w:t>
-      </w:r>
-      <w:bookmarkEnd w:id="21"/>
-    </w:p>
-    <w:p>
-      <w:pPr>
-        <w:pStyle w:val="FirstParagraph"/>
-      </w:pPr>
-      <w:r>
-        <w:rPr>
-          <w:rFonts w:ascii="Times New Roman" w:eastAsia="Times New Roman" w:hAnsi="Times New Roman"/>
-        </w:rPr>
-        <w:t>Bộ tạo tín hiệu thử sử dụng Arduino UNO để phát các dạng tín hiệu phục vụ kiểm tra, gồm xung tuần hoàn, UART bit-bang và I2C dạng open-drain. Khối này phù hợp để tạo dữ liệu đầu vào cho việc quan sát waveform và kiểm tra decoder; kết quả chạy thực nghiệm cần được bổ sung bằng ảnh chụp hoặc log sau khi đo trên phần cứng.</w:t>
-      </w:r>
-    </w:p>
-    <w:p>
-      <w:pPr>
-        <w:pStyle w:val="Heading1"/>
-      </w:pPr>
-      <w:bookmarkStart w:id="22" w:name="_Toc234276613"/>
-      <w:r>
-        <w:t>TRIỂN KHAI VÀ KIỂM THỬ</w:t>
-      </w:r>
-      <w:bookmarkEnd w:id="22"/>
-    </w:p>
-    <w:p>
-      <w:pPr>
-        <w:pStyle w:val="Heading2"/>
-      </w:pPr>
       <w:bookmarkStart w:id="23" w:name="_Toc234276614"/>
       <w:r>
+        <w:lastRenderedPageBreak/>
         <w:t>Cấu hình build</w:t>
       </w:r>
       <w:bookmarkEnd w:id="23"/>
@@ -6267,15 +6642,7 @@
                 <w:rFonts w:ascii="Times New Roman" w:eastAsia="Times New Roman" w:hAnsi="Times New Roman"/>
                 <w:sz w:val="26"/>
               </w:rPr>
-              <w:t xml:space="preserve">Đưa tín hiệu vào PA0..PA7 và quan </w:t>
-            </w:r>
-            <w:r>
-              <w:rPr>
-                <w:rFonts w:ascii="Times New Roman" w:eastAsia="Times New Roman" w:hAnsi="Times New Roman"/>
-                <w:sz w:val="26"/>
-              </w:rPr>
-              <w:lastRenderedPageBreak/>
-              <w:t>sát CH0..CH7.</w:t>
+              <w:t>Đưa tín hiệu vào PA0..PA7 và quan sát CH0..CH7.</w:t>
             </w:r>
           </w:p>
         </w:tc>
@@ -6298,7 +6665,6 @@
                 <w:rFonts w:ascii="Times New Roman" w:eastAsia="Times New Roman" w:hAnsi="Times New Roman"/>
                 <w:sz w:val="26"/>
               </w:rPr>
-              <w:lastRenderedPageBreak/>
               <w:t>[CHƯA CÓ DỮ LIỆU]</w:t>
             </w:r>
           </w:p>
@@ -6746,7 +7112,15 @@
                 <w:rFonts w:ascii="Times New Roman" w:eastAsia="Times New Roman" w:hAnsi="Times New Roman"/>
                 <w:sz w:val="26"/>
               </w:rPr>
-              <w:t>Thực hiện sau khi có mạch bảo vệ đầu vào.</w:t>
+              <w:t xml:space="preserve">Thực hiện sau khi có mạch bảo vệ </w:t>
+            </w:r>
+            <w:r>
+              <w:rPr>
+                <w:rFonts w:ascii="Times New Roman" w:eastAsia="Times New Roman" w:hAnsi="Times New Roman"/>
+                <w:sz w:val="26"/>
+              </w:rPr>
+              <w:lastRenderedPageBreak/>
+              <w:t>đầu vào.</w:t>
             </w:r>
           </w:p>
         </w:tc>
@@ -6769,7 +7143,16 @@
                 <w:rFonts w:ascii="Times New Roman" w:eastAsia="Times New Roman" w:hAnsi="Times New Roman"/>
                 <w:sz w:val="26"/>
               </w:rPr>
-              <w:t>[CẦN BỔ SUNG: thiết kế bảo vệ đầu vào]</w:t>
+              <w:lastRenderedPageBreak/>
+              <w:t xml:space="preserve">[CẦN BỔ SUNG: thiết kế bảo vệ đầu </w:t>
+            </w:r>
+            <w:r>
+              <w:rPr>
+                <w:rFonts w:ascii="Times New Roman" w:eastAsia="Times New Roman" w:hAnsi="Times New Roman"/>
+                <w:sz w:val="26"/>
+              </w:rPr>
+              <w:lastRenderedPageBreak/>
+              <w:t>vào]</w:t>
             </w:r>
           </w:p>
         </w:tc>
@@ -6781,6 +7164,7 @@
       </w:pPr>
       <w:bookmarkStart w:id="25" w:name="_Toc234276616"/>
       <w:r>
+        <w:lastRenderedPageBreak/>
         <w:t>Khung kết quả đo</w:t>
       </w:r>
       <w:bookmarkEnd w:id="25"/>
@@ -7552,15 +7936,7 @@
                 <w:rFonts w:ascii="Times New Roman" w:eastAsia="Times New Roman" w:hAnsi="Times New Roman"/>
                 <w:sz w:val="26"/>
               </w:rPr>
-              <w:t xml:space="preserve">Nhận diện START/STOP, </w:t>
-            </w:r>
-            <w:r>
-              <w:rPr>
-                <w:rFonts w:ascii="Times New Roman" w:eastAsia="Times New Roman" w:hAnsi="Times New Roman"/>
-                <w:sz w:val="26"/>
-              </w:rPr>
-              <w:lastRenderedPageBreak/>
-              <w:t>ADDR/DATA.</w:t>
+              <w:t>Nhận diện START/STOP, ADDR/DATA.</w:t>
             </w:r>
           </w:p>
         </w:tc>
@@ -7583,7 +7959,6 @@
                 <w:rFonts w:ascii="Times New Roman" w:eastAsia="Times New Roman" w:hAnsi="Times New Roman"/>
                 <w:sz w:val="26"/>
               </w:rPr>
-              <w:lastRenderedPageBreak/>
               <w:t>[CHƯA CÓ DỮ LIỆU]</w:t>
             </w:r>
           </w:p>
@@ -7885,7 +8260,15 @@
                 <w:rFonts w:ascii="Times New Roman" w:eastAsia="Times New Roman" w:hAnsi="Times New Roman"/>
                 <w:sz w:val="26"/>
               </w:rPr>
-              <w:t>Đạt ở mức thiết kế; cần demo phần cứng.</w:t>
+              <w:t xml:space="preserve">Đạt ở mức thiết kế; cần </w:t>
+            </w:r>
+            <w:r>
+              <w:rPr>
+                <w:rFonts w:ascii="Times New Roman" w:eastAsia="Times New Roman" w:hAnsi="Times New Roman"/>
+                <w:sz w:val="26"/>
+              </w:rPr>
+              <w:lastRenderedPageBreak/>
+              <w:t>demo phần cứng.</w:t>
             </w:r>
           </w:p>
         </w:tc>
@@ -7910,6 +8293,7 @@
                 <w:rFonts w:ascii="Times New Roman" w:eastAsia="Times New Roman" w:hAnsi="Times New Roman"/>
                 <w:sz w:val="26"/>
               </w:rPr>
+              <w:lastRenderedPageBreak/>
               <w:t>Tốc độ tối thiểu</w:t>
             </w:r>
           </w:p>
@@ -8259,10 +8643,14 @@
     <w:p>
       <w:pPr>
         <w:pStyle w:val="Compact"/>
+        <w:rPr>
+          <w:highlight w:val="yellow"/>
+        </w:rPr>
       </w:pPr>
       <w:r>
         <w:rPr>
           <w:rFonts w:ascii="Times New Roman" w:eastAsia="Times New Roman" w:hAnsi="Times New Roman"/>
+          <w:highlight w:val="yellow"/>
         </w:rPr>
         <w:t>Chưa có sơ đồ nguyên lý và sơ đồ nối dây đầy đủ.</w:t>
       </w:r>
@@ -8270,10 +8658,14 @@
     <w:p>
       <w:pPr>
         <w:pStyle w:val="Compact"/>
+        <w:rPr>
+          <w:highlight w:val="yellow"/>
+        </w:rPr>
       </w:pPr>
       <w:r>
         <w:rPr>
           <w:rFonts w:ascii="Times New Roman" w:eastAsia="Times New Roman" w:hAnsi="Times New Roman"/>
+          <w:highlight w:val="yellow"/>
         </w:rPr>
         <w:t>Chưa có mạch bảo vệ đầu vào được mô tả bằng linh kiện cụ thể.</w:t>
       </w:r>
@@ -8285,6 +8677,7 @@
       <w:r>
         <w:rPr>
           <w:rFonts w:ascii="Times New Roman" w:eastAsia="Times New Roman" w:hAnsi="Times New Roman"/>
+          <w:highlight w:val="yellow"/>
         </w:rPr>
         <w:t>Chưa có ảnh chụp phần cứng, ảnh waveform, log STATUS/BENCH hoặc dữ liệu capture mẫu.</w:t>
       </w:r>
@@ -8307,6 +8700,7 @@
       <w:r>
         <w:rPr>
           <w:rFonts w:ascii="Times New Roman" w:eastAsia="Times New Roman" w:hAnsi="Times New Roman"/>
+          <w:highlight w:val="yellow"/>
         </w:rPr>
         <w:t>Chưa thấy decoder SPI trong mã nguồn.</w:t>
       </w:r>
@@ -8351,70 +8745,70 @@
         <w:rPr>
           <w:rFonts w:ascii="Times New Roman" w:eastAsia="Times New Roman" w:hAnsi="Times New Roman"/>
         </w:rPr>
+        <w:t>Đo timing bằng tín hiệu tham chiếu để hoàn thiện phần đánh giá độ chính xác.</w:t>
+      </w:r>
+    </w:p>
+    <w:p>
+      <w:pPr>
+        <w:pStyle w:val="Compact"/>
+      </w:pPr>
+      <w:r>
+        <w:rPr>
+          <w:rFonts w:ascii="Times New Roman" w:eastAsia="Times New Roman" w:hAnsi="Times New Roman"/>
+        </w:rPr>
+        <w:t>Bổ sung decoder SPI hoặc nêu rõ phạm vi sản phẩm chỉ hỗ trợ UART/I2C.</w:t>
+      </w:r>
+    </w:p>
+    <w:p>
+      <w:pPr>
+        <w:pStyle w:val="Compact"/>
+      </w:pPr>
+      <w:r>
+        <w:rPr>
+          <w:rFonts w:ascii="Times New Roman" w:eastAsia="Times New Roman" w:hAnsi="Times New Roman"/>
+        </w:rPr>
+        <w:t>Thêm test tự động cho protocol_frame.py và các decoder để kiểm soát lỗi hồi quy.</w:t>
+      </w:r>
+    </w:p>
+    <w:p>
+      <w:pPr>
+        <w:pStyle w:val="Heading1"/>
+      </w:pPr>
+      <w:bookmarkStart w:id="31" w:name="_Toc234276621"/>
+      <w:r>
+        <w:t>KẾT LUẬN</w:t>
+      </w:r>
+      <w:bookmarkEnd w:id="31"/>
+    </w:p>
+    <w:p>
+      <w:pPr>
+        <w:pStyle w:val="FirstParagraph"/>
+      </w:pPr>
+      <w:r>
+        <w:rPr>
+          <w:rFonts w:ascii="Times New Roman" w:eastAsia="Times New Roman" w:hAnsi="Times New Roman"/>
+        </w:rPr>
+        <w:t>Đề tài Topic 1 hướng tới việc xây dựng một logic analyzer đơn giản nhưng thể hiện đầy đủ chuỗi xử lý của một thiết bị đo tín hiệu số: lấy mẫu, lưu đệm, truyền dữ liệu, hiển thị waveform và giải mã giao thức. Dựa trên phần triển khai hiện tại, hệ thống đã hình thành được nền tảng firmware STM32 và phần mềm PC cho mục tiêu này.</w:t>
+      </w:r>
+    </w:p>
+    <w:p>
+      <w:pPr>
+        <w:pStyle w:val="BodyText"/>
+      </w:pPr>
+      <w:r>
+        <w:rPr>
+          <w:rFonts w:ascii="Times New Roman" w:eastAsia="Times New Roman" w:hAnsi="Times New Roman"/>
+        </w:rPr>
+        <w:t>Các phần có thể khẳng định chắc chắn hiện nằm ở mức thiết kế và triển khai. Để báo cáo đạt mức hoàn chỉnh cho bảo vệ, cần bổ sung minh chứng phần cứng gồm sơ đồ mạch, ảnh demo, log capture và số đo timing thực tế.</w:t>
+      </w:r>
+    </w:p>
+    <w:p>
+      <w:pPr>
+        <w:pStyle w:val="Heading1unnumbered"/>
+      </w:pPr>
+      <w:bookmarkStart w:id="32" w:name="_Toc234276622"/>
+      <w:r>
         <w:lastRenderedPageBreak/>
-        <w:t>Đo timing bằng tín hiệu tham chiếu để hoàn thiện phần đánh giá độ chính xác.</w:t>
-      </w:r>
-    </w:p>
-    <w:p>
-      <w:pPr>
-        <w:pStyle w:val="Compact"/>
-      </w:pPr>
-      <w:r>
-        <w:rPr>
-          <w:rFonts w:ascii="Times New Roman" w:eastAsia="Times New Roman" w:hAnsi="Times New Roman"/>
-        </w:rPr>
-        <w:t>Bổ sung decoder SPI hoặc nêu rõ phạm vi sản phẩm chỉ hỗ trợ UART/I2C.</w:t>
-      </w:r>
-    </w:p>
-    <w:p>
-      <w:pPr>
-        <w:pStyle w:val="Compact"/>
-      </w:pPr>
-      <w:r>
-        <w:rPr>
-          <w:rFonts w:ascii="Times New Roman" w:eastAsia="Times New Roman" w:hAnsi="Times New Roman"/>
-        </w:rPr>
-        <w:t>Thêm test tự động cho protocol_frame.py và các decoder để kiểm soát lỗi hồi quy.</w:t>
-      </w:r>
-    </w:p>
-    <w:p>
-      <w:pPr>
-        <w:pStyle w:val="Heading1"/>
-      </w:pPr>
-      <w:bookmarkStart w:id="31" w:name="_Toc234276621"/>
-      <w:r>
-        <w:t>KẾT LUẬN</w:t>
-      </w:r>
-      <w:bookmarkEnd w:id="31"/>
-    </w:p>
-    <w:p>
-      <w:pPr>
-        <w:pStyle w:val="FirstParagraph"/>
-      </w:pPr>
-      <w:r>
-        <w:rPr>
-          <w:rFonts w:ascii="Times New Roman" w:eastAsia="Times New Roman" w:hAnsi="Times New Roman"/>
-        </w:rPr>
-        <w:t>Đề tài Topic 1 hướng tới việc xây dựng một logic analyzer đơn giản nhưng thể hiện đầy đủ chuỗi xử lý của một thiết bị đo tín hiệu số: lấy mẫu, lưu đệm, truyền dữ liệu, hiển thị waveform và giải mã giao thức. Dựa trên phần triển khai hiện tại, hệ thống đã hình thành được nền tảng firmware STM32 và phần mềm PC cho mục tiêu này.</w:t>
-      </w:r>
-    </w:p>
-    <w:p>
-      <w:pPr>
-        <w:pStyle w:val="BodyText"/>
-      </w:pPr>
-      <w:r>
-        <w:rPr>
-          <w:rFonts w:ascii="Times New Roman" w:eastAsia="Times New Roman" w:hAnsi="Times New Roman"/>
-        </w:rPr>
-        <w:t>Các phần có thể khẳng định chắc chắn hiện nằm ở mức thiết kế và triển khai. Để báo cáo đạt mức hoàn chỉnh cho bảo vệ, cần bổ sung minh chứng phần cứng gồm sơ đồ mạch, ảnh demo, log capture và số đo timing thực tế.</w:t>
-      </w:r>
-    </w:p>
-    <w:p>
-      <w:pPr>
-        <w:pStyle w:val="Heading1unnumbered"/>
-      </w:pPr>
-      <w:bookmarkStart w:id="32" w:name="_Toc234276622"/>
-      <w:r>
         <w:t>TÀI LIỆU THAM KHẢO</w:t>
       </w:r>
       <w:bookmarkEnd w:id="32"/>
@@ -8540,7 +8934,6 @@
         <w:docPartUnique/>
       </w:docPartObj>
     </w:sdtPr>
-    <w:sdtEndPr/>
     <w:sdtContent>
       <w:p>
         <w:pPr>
@@ -8588,7 +8981,6 @@
         <w:docPartUnique/>
       </w:docPartObj>
     </w:sdtPr>
-    <w:sdtEndPr/>
     <w:sdtContent>
       <w:p>
         <w:pPr>

</xml_diff>